<commit_message>
Real Amazon delivery routes test
</commit_message>
<xml_diff>
--- a/paper_nhsjs/routing_model_nhsjs.docx
+++ b/paper_nhsjs/routing_model_nhsjs.docx
@@ -163,31 +163,145 @@
         <w:t xml:space="preserve"> </w:t>
       </w:r>
       <w:r>
+        <w:t xml:space="preserve">time</w:t>
+      </w:r>
+      <w:r>
+        <w:t xml:space="preserve"> </w:t>
+      </w:r>
+      <w:r>
+        <w:t xml:space="preserve">windows</w:t>
+      </w:r>
+      <w:r>
+        <w:t xml:space="preserve"> </w:t>
+      </w:r>
+      <w:r>
+        <w:t xml:space="preserve">but</w:t>
+      </w:r>
+      <w:r>
+        <w:t xml:space="preserve"> </w:t>
+      </w:r>
+      <w:r>
+        <w:t xml:space="preserve">plan</w:t>
+      </w:r>
+      <w:r>
+        <w:t xml:space="preserve"> </w:t>
+      </w:r>
+      <w:r>
+        <w:t xml:space="preserve">routes</w:t>
+      </w:r>
+      <w:r>
+        <w:t xml:space="preserve"> </w:t>
+      </w:r>
+      <w:r>
+        <w:t xml:space="preserve">on</w:t>
+      </w:r>
+      <w:r>
+        <w:t xml:space="preserve"> </w:t>
+      </w:r>
+      <w:r>
+        <w:t xml:space="preserve">average</w:t>
+      </w:r>
+      <w:r>
+        <w:t xml:space="preserve"> </w:t>
+      </w:r>
+      <w:r>
+        <w:t xml:space="preserve">travel</w:t>
+      </w:r>
+      <w:r>
+        <w:t xml:space="preserve"> </w:t>
+      </w:r>
+      <w:r>
+        <w:t xml:space="preserve">times,</w:t>
+      </w:r>
+      <w:r>
+        <w:t xml:space="preserve"> </w:t>
+      </w:r>
+      <w:r>
+        <w:t xml:space="preserve">and</w:t>
+      </w:r>
+      <w:r>
+        <w:t xml:space="preserve"> </w:t>
+      </w:r>
+      <w:r>
+        <w:t xml:space="preserve">one</w:t>
+      </w:r>
+      <w:r>
+        <w:t xml:space="preserve"> </w:t>
+      </w:r>
+      <w:r>
+        <w:t xml:space="preserve">delay</w:t>
+      </w:r>
+      <w:r>
+        <w:t xml:space="preserve"> </w:t>
+      </w:r>
+      <w:r>
+        <w:t xml:space="preserve">can</w:t>
+      </w:r>
+      <w:r>
+        <w:t xml:space="preserve"> </w:t>
+      </w:r>
+      <w:r>
+        <w:t xml:space="preserve">make</w:t>
+      </w:r>
+      <w:r>
+        <w:t xml:space="preserve"> </w:t>
+      </w:r>
+      <w:r>
         <w:t xml:space="preserve">a</w:t>
       </w:r>
       <w:r>
         <w:t xml:space="preserve"> </w:t>
       </w:r>
       <w:r>
-        <w:t xml:space="preserve">time</w:t>
-      </w:r>
-      <w:r>
-        <w:t xml:space="preserve"> </w:t>
-      </w:r>
-      <w:r>
-        <w:t xml:space="preserve">window,</w:t>
-      </w:r>
-      <w:r>
-        <w:t xml:space="preserve"> </w:t>
-      </w:r>
-      <w:r>
-        <w:t xml:space="preserve">but</w:t>
-      </w:r>
-      <w:r>
-        <w:t xml:space="preserve"> </w:t>
-      </w:r>
-      <w:r>
-        <w:t xml:space="preserve">they</w:t>
+        <w:t xml:space="preserve">driver</w:t>
+      </w:r>
+      <w:r>
+        <w:t xml:space="preserve"> </w:t>
+      </w:r>
+      <w:r>
+        <w:t xml:space="preserve">miss</w:t>
+      </w:r>
+      <w:r>
+        <w:t xml:space="preserve"> </w:t>
+      </w:r>
+      <w:r>
+        <w:t xml:space="preserve">several</w:t>
+      </w:r>
+      <w:r>
+        <w:t xml:space="preserve"> </w:t>
+      </w:r>
+      <w:r>
+        <w:t xml:space="preserve">windows.</w:t>
+      </w:r>
+      <w:r>
+        <w:t xml:space="preserve"> </w:t>
+      </w:r>
+      <w:r>
+        <w:t xml:space="preserve">The</w:t>
+      </w:r>
+      <w:r>
+        <w:t xml:space="preserve"> </w:t>
+      </w:r>
+      <w:r>
+        <w:t xml:space="preserve">usual</w:t>
+      </w:r>
+      <w:r>
+        <w:t xml:space="preserve"> </w:t>
+      </w:r>
+      <w:r>
+        <w:t xml:space="preserve">protection</w:t>
+      </w:r>
+      <w:r>
+        <w:t xml:space="preserve"> </w:t>
+      </w:r>
+      <w:r>
+        <w:t xml:space="preserve">is</w:t>
+      </w:r>
+      <w:r>
+        <w:t xml:space="preserve"> </w:t>
+      </w:r>
+      <w:r>
+        <w:t xml:space="preserve">to</w:t>
       </w:r>
       <w:r>
         <w:t xml:space="preserve"> </w:t>
@@ -199,247 +313,115 @@
         <w:t xml:space="preserve"> </w:t>
       </w:r>
       <w:r>
+        <w:t xml:space="preserve">with</w:t>
+      </w:r>
+      <w:r>
+        <w:t xml:space="preserve"> </w:t>
+      </w:r>
+      <w:r>
+        <w:t xml:space="preserve">slower</w:t>
+      </w:r>
+      <w:r>
+        <w:t xml:space="preserve"> </w:t>
+      </w:r>
+      <w:r>
+        <w:t xml:space="preserve">speeds,</w:t>
+      </w:r>
+      <w:r>
+        <w:t xml:space="preserve"> </w:t>
+      </w:r>
+      <w:r>
+        <w:t xml:space="preserve">padding</w:t>
+      </w:r>
+      <w:r>
+        <w:t xml:space="preserve"> </w:t>
+      </w:r>
+      <w:r>
+        <w:t xml:space="preserve">every</w:t>
+      </w:r>
+      <w:r>
+        <w:t xml:space="preserve"> </w:t>
+      </w:r>
+      <w:r>
+        <w:t xml:space="preserve">trip.</w:t>
+      </w:r>
+      <w:r>
+        <w:t xml:space="preserve"> </w:t>
+      </w:r>
+      <w:r>
+        <w:t xml:space="preserve">This</w:t>
+      </w:r>
+      <w:r>
+        <w:t xml:space="preserve"> </w:t>
+      </w:r>
+      <w:r>
+        <w:t xml:space="preserve">study</w:t>
+      </w:r>
+      <w:r>
+        <w:t xml:space="preserve"> </w:t>
+      </w:r>
+      <w:r>
+        <w:t xml:space="preserve">asks</w:t>
+      </w:r>
+      <w:r>
+        <w:t xml:space="preserve"> </w:t>
+      </w:r>
+      <w:r>
+        <w:t xml:space="preserve">whether</w:t>
+      </w:r>
+      <w:r>
+        <w:t xml:space="preserve"> </w:t>
+      </w:r>
+      <w:r>
+        <w:t xml:space="preserve">a</w:t>
+      </w:r>
+      <w:r>
+        <w:t xml:space="preserve"> </w:t>
+      </w:r>
+      <w:r>
+        <w:t xml:space="preserve">statistical</w:t>
+      </w:r>
+      <w:r>
+        <w:t xml:space="preserve"> </w:t>
+      </w:r>
+      <w:r>
+        <w:t xml:space="preserve">check</w:t>
+      </w:r>
+      <w:r>
+        <w:t xml:space="preserve"> </w:t>
+      </w:r>
+      <w:r>
+        <w:t xml:space="preserve">on</w:t>
+      </w:r>
+      <w:r>
+        <w:t xml:space="preserve"> </w:t>
+      </w:r>
+      <w:r>
+        <w:t xml:space="preserve">an</w:t>
+      </w:r>
+      <w:r>
+        <w:t xml:space="preserve"> </w:t>
+      </w:r>
+      <w:r>
+        <w:t xml:space="preserve">ordinary</w:t>
+      </w:r>
+      <w:r>
+        <w:t xml:space="preserve"> </w:t>
+      </w:r>
+      <w:r>
+        <w:t xml:space="preserve">planner’s</w:t>
+      </w:r>
+      <w:r>
+        <w:t xml:space="preserve"> </w:t>
+      </w:r>
+      <w:r>
         <w:t xml:space="preserve">routes</w:t>
       </w:r>
       <w:r>
         <w:t xml:space="preserve"> </w:t>
       </w:r>
       <w:r>
-        <w:t xml:space="preserve">on</w:t>
-      </w:r>
-      <w:r>
-        <w:t xml:space="preserve"> </w:t>
-      </w:r>
-      <w:r>
-        <w:t xml:space="preserve">average</w:t>
-      </w:r>
-      <w:r>
-        <w:t xml:space="preserve"> </w:t>
-      </w:r>
-      <w:r>
-        <w:t xml:space="preserve">travel</w:t>
-      </w:r>
-      <w:r>
-        <w:t xml:space="preserve"> </w:t>
-      </w:r>
-      <w:r>
-        <w:t xml:space="preserve">times,</w:t>
-      </w:r>
-      <w:r>
-        <w:t xml:space="preserve"> </w:t>
-      </w:r>
-      <w:r>
-        <w:t xml:space="preserve">and</w:t>
-      </w:r>
-      <w:r>
-        <w:t xml:space="preserve"> </w:t>
-      </w:r>
-      <w:r>
-        <w:t xml:space="preserve">one</w:t>
-      </w:r>
-      <w:r>
-        <w:t xml:space="preserve"> </w:t>
-      </w:r>
-      <w:r>
-        <w:t xml:space="preserve">delay</w:t>
-      </w:r>
-      <w:r>
-        <w:t xml:space="preserve"> </w:t>
-      </w:r>
-      <w:r>
-        <w:t xml:space="preserve">can</w:t>
-      </w:r>
-      <w:r>
-        <w:t xml:space="preserve"> </w:t>
-      </w:r>
-      <w:r>
-        <w:t xml:space="preserve">make</w:t>
-      </w:r>
-      <w:r>
-        <w:t xml:space="preserve"> </w:t>
-      </w:r>
-      <w:r>
-        <w:t xml:space="preserve">a</w:t>
-      </w:r>
-      <w:r>
-        <w:t xml:space="preserve"> </w:t>
-      </w:r>
-      <w:r>
-        <w:t xml:space="preserve">driver</w:t>
-      </w:r>
-      <w:r>
-        <w:t xml:space="preserve"> </w:t>
-      </w:r>
-      <w:r>
-        <w:t xml:space="preserve">miss</w:t>
-      </w:r>
-      <w:r>
-        <w:t xml:space="preserve"> </w:t>
-      </w:r>
-      <w:r>
-        <w:t xml:space="preserve">several</w:t>
-      </w:r>
-      <w:r>
-        <w:t xml:space="preserve"> </w:t>
-      </w:r>
-      <w:r>
-        <w:t xml:space="preserve">windows.</w:t>
-      </w:r>
-      <w:r>
-        <w:t xml:space="preserve"> </w:t>
-      </w:r>
-      <w:r>
-        <w:t xml:space="preserve">The</w:t>
-      </w:r>
-      <w:r>
-        <w:t xml:space="preserve"> </w:t>
-      </w:r>
-      <w:r>
-        <w:t xml:space="preserve">usual</w:t>
-      </w:r>
-      <w:r>
-        <w:t xml:space="preserve"> </w:t>
-      </w:r>
-      <w:r>
-        <w:t xml:space="preserve">protection</w:t>
-      </w:r>
-      <w:r>
-        <w:t xml:space="preserve"> </w:t>
-      </w:r>
-      <w:r>
         <w:t xml:space="preserve">is</w:t>
-      </w:r>
-      <w:r>
-        <w:t xml:space="preserve"> </w:t>
-      </w:r>
-      <w:r>
-        <w:t xml:space="preserve">to</w:t>
-      </w:r>
-      <w:r>
-        <w:t xml:space="preserve"> </w:t>
-      </w:r>
-      <w:r>
-        <w:t xml:space="preserve">plan</w:t>
-      </w:r>
-      <w:r>
-        <w:t xml:space="preserve"> </w:t>
-      </w:r>
-      <w:r>
-        <w:t xml:space="preserve">with</w:t>
-      </w:r>
-      <w:r>
-        <w:t xml:space="preserve"> </w:t>
-      </w:r>
-      <w:r>
-        <w:t xml:space="preserve">slower</w:t>
-      </w:r>
-      <w:r>
-        <w:t xml:space="preserve"> </w:t>
-      </w:r>
-      <w:r>
-        <w:t xml:space="preserve">speeds,</w:t>
-      </w:r>
-      <w:r>
-        <w:t xml:space="preserve"> </w:t>
-      </w:r>
-      <w:r>
-        <w:t xml:space="preserve">padding</w:t>
-      </w:r>
-      <w:r>
-        <w:t xml:space="preserve"> </w:t>
-      </w:r>
-      <w:r>
-        <w:t xml:space="preserve">every</w:t>
-      </w:r>
-      <w:r>
-        <w:t xml:space="preserve"> </w:t>
-      </w:r>
-      <w:r>
-        <w:t xml:space="preserve">trip.</w:t>
-      </w:r>
-      <w:r>
-        <w:t xml:space="preserve"> </w:t>
-      </w:r>
-      <w:r>
-        <w:t xml:space="preserve">This</w:t>
-      </w:r>
-      <w:r>
-        <w:t xml:space="preserve"> </w:t>
-      </w:r>
-      <w:r>
-        <w:t xml:space="preserve">study</w:t>
-      </w:r>
-      <w:r>
-        <w:t xml:space="preserve"> </w:t>
-      </w:r>
-      <w:r>
-        <w:t xml:space="preserve">asks</w:t>
-      </w:r>
-      <w:r>
-        <w:t xml:space="preserve"> </w:t>
-      </w:r>
-      <w:r>
-        <w:t xml:space="preserve">whether</w:t>
-      </w:r>
-      <w:r>
-        <w:t xml:space="preserve"> </w:t>
-      </w:r>
-      <w:r>
-        <w:t xml:space="preserve">a</w:t>
-      </w:r>
-      <w:r>
-        <w:t xml:space="preserve"> </w:t>
-      </w:r>
-      <w:r>
-        <w:t xml:space="preserve">statistical</w:t>
-      </w:r>
-      <w:r>
-        <w:t xml:space="preserve"> </w:t>
-      </w:r>
-      <w:r>
-        <w:t xml:space="preserve">check</w:t>
-      </w:r>
-      <w:r>
-        <w:t xml:space="preserve"> </w:t>
-      </w:r>
-      <w:r>
-        <w:t xml:space="preserve">on</w:t>
-      </w:r>
-      <w:r>
-        <w:t xml:space="preserve"> </w:t>
-      </w:r>
-      <w:r>
-        <w:t xml:space="preserve">an</w:t>
-      </w:r>
-      <w:r>
-        <w:t xml:space="preserve"> </w:t>
-      </w:r>
-      <w:r>
-        <w:t xml:space="preserve">ordinary</w:t>
-      </w:r>
-      <w:r>
-        <w:t xml:space="preserve"> </w:t>
-      </w:r>
-      <w:r>
-        <w:t xml:space="preserve">planner’s</w:t>
-      </w:r>
-      <w:r>
-        <w:t xml:space="preserve"> </w:t>
-      </w:r>
-      <w:r>
-        <w:t xml:space="preserve">routes</w:t>
-      </w:r>
-      <w:r>
-        <w:t xml:space="preserve"> </w:t>
-      </w:r>
-      <w:r>
-        <w:t xml:space="preserve">is</w:t>
-      </w:r>
-      <w:r>
-        <w:t xml:space="preserve"> </w:t>
-      </w:r>
-      <w:r>
-        <w:t xml:space="preserve">a</w:t>
       </w:r>
       <w:r>
         <w:t xml:space="preserve"> </w:t>
@@ -821,12 +803,6 @@
         <w:t xml:space="preserve"> </w:t>
       </w:r>
       <w:r>
-        <w:t xml:space="preserve">then</w:t>
-      </w:r>
-      <w:r>
-        <w:t xml:space="preserve"> </w:t>
-      </w:r>
-      <w:r>
         <w:t xml:space="preserve">tested</w:t>
       </w:r>
       <w:r>
@@ -977,6 +953,36 @@
         <w:t xml:space="preserve"> </w:t>
       </w:r>
       <w:r>
+        <w:t xml:space="preserve">40</w:t>
+      </w:r>
+      <w:r>
+        <w:t xml:space="preserve"> </w:t>
+      </w:r>
+      <w:r>
+        <w:t xml:space="preserve">real</w:t>
+      </w:r>
+      <w:r>
+        <w:t xml:space="preserve"> </w:t>
+      </w:r>
+      <w:r>
+        <w:t xml:space="preserve">Amazon</w:t>
+      </w:r>
+      <w:r>
+        <w:t xml:space="preserve"> </w:t>
+      </w:r>
+      <w:r>
+        <w:t xml:space="preserve">delivery</w:t>
+      </w:r>
+      <w:r>
+        <w:t xml:space="preserve"> </w:t>
+      </w:r>
+      <w:r>
+        <w:t xml:space="preserve">routes,</w:t>
+      </w:r>
+      <w:r>
+        <w:t xml:space="preserve"> </w:t>
+      </w:r>
+      <w:r>
         <w:t xml:space="preserve">a</w:t>
       </w:r>
       <w:r>
@@ -1043,7 +1049,7 @@
         <w:t xml:space="preserve"> </w:t>
       </w:r>
       <w:r>
-        <w:t xml:space="preserve">whose</w:t>
+        <w:t xml:space="preserve">with</w:t>
       </w:r>
       <w:r>
         <w:t xml:space="preserve"> </w:t>
@@ -1055,37 +1061,19 @@
         <w:t xml:space="preserve"> </w:t>
       </w:r>
       <w:r>
-        <w:t xml:space="preserve">were</w:t>
-      </w:r>
-      <w:r>
-        <w:t xml:space="preserve"> </w:t>
-      </w:r>
-      <w:r>
         <w:t xml:space="preserve">published</w:t>
       </w:r>
       <w:r>
         <w:t xml:space="preserve"> </w:t>
       </w:r>
       <w:r>
-        <w:t xml:space="preserve">before</w:t>
-      </w:r>
-      <w:r>
-        <w:t xml:space="preserve"> </w:t>
-      </w:r>
-      <w:r>
-        <w:t xml:space="preserve">they</w:t>
-      </w:r>
-      <w:r>
-        <w:t xml:space="preserve"> </w:t>
-      </w:r>
-      <w:r>
-        <w:t xml:space="preserve">were</w:t>
-      </w:r>
-      <w:r>
-        <w:t xml:space="preserve"> </w:t>
-      </w:r>
-      <w:r>
-        <w:t xml:space="preserve">run.</w:t>
+        <w:t xml:space="preserve">in</w:t>
+      </w:r>
+      <w:r>
+        <w:t xml:space="preserve"> </w:t>
+      </w:r>
+      <w:r>
+        <w:t xml:space="preserve">advance.</w:t>
       </w:r>
       <w:r>
         <w:t xml:space="preserve"> </w:t>
@@ -1323,19 +1311,85 @@
         <w:t xml:space="preserve"> </w:t>
       </w:r>
       <w:r>
-        <w:t xml:space="preserve">plan</w:t>
-      </w:r>
-      <w:r>
-        <w:t xml:space="preserve"> </w:t>
-      </w:r>
-      <w:r>
-        <w:t xml:space="preserve">at</w:t>
-      </w:r>
-      <w:r>
-        <w:t xml:space="preserve"> </w:t>
-      </w:r>
-      <w:r>
-        <w:t xml:space="preserve">all.</w:t>
+        <w:t xml:space="preserve">plan.</w:t>
+      </w:r>
+      <w:r>
+        <w:t xml:space="preserve"> </w:t>
+      </w:r>
+      <w:r>
+        <w:t xml:space="preserve">On</w:t>
+      </w:r>
+      <w:r>
+        <w:t xml:space="preserve"> </w:t>
+      </w:r>
+      <w:r>
+        <w:t xml:space="preserve">the</w:t>
+      </w:r>
+      <w:r>
+        <w:t xml:space="preserve"> </w:t>
+      </w:r>
+      <w:r>
+        <w:t xml:space="preserve">Amazon</w:t>
+      </w:r>
+      <w:r>
+        <w:t xml:space="preserve"> </w:t>
+      </w:r>
+      <w:r>
+        <w:t xml:space="preserve">routes,</w:t>
+      </w:r>
+      <w:r>
+        <w:t xml:space="preserve"> </w:t>
+      </w:r>
+      <w:r>
+        <w:t xml:space="preserve">screening</w:t>
+      </w:r>
+      <w:r>
+        <w:t xml:space="preserve"> </w:t>
+      </w:r>
+      <w:r>
+        <w:t xml:space="preserve">padded</w:t>
+      </w:r>
+      <w:r>
+        <w:t xml:space="preserve"> </w:t>
+      </w:r>
+      <w:r>
+        <w:t xml:space="preserve">plans</w:t>
+      </w:r>
+      <w:r>
+        <w:t xml:space="preserve"> </w:t>
+      </w:r>
+      <w:r>
+        <w:t xml:space="preserve">raised</w:t>
+      </w:r>
+      <w:r>
+        <w:t xml:space="preserve"> </w:t>
+      </w:r>
+      <w:r>
+        <w:t xml:space="preserve">service</w:t>
+      </w:r>
+      <w:r>
+        <w:t xml:space="preserve"> </w:t>
+      </w:r>
+      <w:r>
+        <w:t xml:space="preserve">from</w:t>
+      </w:r>
+      <w:r>
+        <w:t xml:space="preserve"> </w:t>
+      </w:r>
+      <w:r>
+        <w:t xml:space="preserve">59.0%</w:t>
+      </w:r>
+      <w:r>
+        <w:t xml:space="preserve"> </w:t>
+      </w:r>
+      <w:r>
+        <w:t xml:space="preserve">to</w:t>
+      </w:r>
+      <w:r>
+        <w:t xml:space="preserve"> </w:t>
+      </w:r>
+      <w:r>
+        <w:t xml:space="preserve">75.3%.</w:t>
       </w:r>
       <w:r>
         <w:t xml:space="preserve"> </w:t>
@@ -1501,79 +1555,37 @@
         <w:t xml:space="preserve"> </w:t>
       </w:r>
       <w:r>
-        <w:t xml:space="preserve">evidence</w:t>
-      </w:r>
-      <w:r>
-        <w:t xml:space="preserve"> </w:t>
-      </w:r>
-      <w:r>
-        <w:t xml:space="preserve">comes</w:t>
-      </w:r>
-      <w:r>
-        <w:t xml:space="preserve"> </w:t>
-      </w:r>
-      <w:r>
-        <w:t xml:space="preserve">from</w:t>
-      </w:r>
-      <w:r>
-        <w:t xml:space="preserve"> </w:t>
-      </w:r>
-      <w:r>
-        <w:t xml:space="preserve">simulated</w:t>
-      </w:r>
-      <w:r>
-        <w:t xml:space="preserve"> </w:t>
-      </w:r>
-      <w:r>
-        <w:t xml:space="preserve">cities</w:t>
+        <w:t xml:space="preserve">delay</w:t>
+      </w:r>
+      <w:r>
+        <w:t xml:space="preserve"> </w:t>
+      </w:r>
+      <w:r>
+        <w:t xml:space="preserve">model</w:t>
+      </w:r>
+      <w:r>
+        <w:t xml:space="preserve"> </w:t>
+      </w:r>
+      <w:r>
+        <w:t xml:space="preserve">is</w:t>
+      </w:r>
+      <w:r>
+        <w:t xml:space="preserve"> </w:t>
+      </w:r>
+      <w:r>
+        <w:t xml:space="preserve">still</w:t>
+      </w:r>
+      <w:r>
+        <w:t xml:space="preserve"> </w:t>
+      </w:r>
+      <w:r>
+        <w:t xml:space="preserve">assumed</w:t>
       </w:r>
       <w:r>
         <w:t xml:space="preserve"> </w:t>
       </w:r>
       <w:r>
         <w:t xml:space="preserve">and</w:t>
-      </w:r>
-      <w:r>
-        <w:t xml:space="preserve"> </w:t>
-      </w:r>
-      <w:r>
-        <w:t xml:space="preserve">an</w:t>
-      </w:r>
-      <w:r>
-        <w:t xml:space="preserve"> </w:t>
-      </w:r>
-      <w:r>
-        <w:t xml:space="preserve">assumed</w:t>
-      </w:r>
-      <w:r>
-        <w:t xml:space="preserve"> </w:t>
-      </w:r>
-      <w:r>
-        <w:t xml:space="preserve">delay</w:t>
-      </w:r>
-      <w:r>
-        <w:t xml:space="preserve"> </w:t>
-      </w:r>
-      <w:r>
-        <w:t xml:space="preserve">model,</w:t>
-      </w:r>
-      <w:r>
-        <w:t xml:space="preserve"> </w:t>
-      </w:r>
-      <w:r>
-        <w:t xml:space="preserve">so</w:t>
-      </w:r>
-      <w:r>
-        <w:t xml:space="preserve"> </w:t>
-      </w:r>
-      <w:r>
-        <w:t xml:space="preserve">it</w:t>
-      </w:r>
-      <w:r>
-        <w:t xml:space="preserve"> </w:t>
-      </w:r>
-      <w:r>
-        <w:t xml:space="preserve">still</w:t>
       </w:r>
       <w:r>
         <w:t xml:space="preserve"> </w:t>
@@ -2200,19 +2212,31 @@
         <w:pStyle w:val="FirstParagraph"/>
       </w:pPr>
       <w:r>
-        <w:t xml:space="preserve">All instances are synthetic, and travel-time delays follow an assumed model rather</w:t>
-      </w:r>
-      <w:r>
-        <w:t xml:space="preserve"> </w:t>
-      </w:r>
-      <w:r>
-        <w:t xml:space="preserve">than measured traffic data. The study therefore tests whether the procedure works</w:t>
-      </w:r>
-      <w:r>
-        <w:t xml:space="preserve"> </w:t>
-      </w:r>
-      <w:r>
-        <w:t xml:space="preserve">under controlled conditions, not how a particular fleet would perform.</w:t>
+        <w:t xml:space="preserve">Most instances are synthetic. A further test uses 40 real Amazon delivery routes,</w:t>
+      </w:r>
+      <w:r>
+        <w:t xml:space="preserve"> </w:t>
+      </w:r>
+      <w:r>
+        <w:t xml:space="preserve">with real stops, travel times and service times but assumed two-hour delivery</w:t>
+      </w:r>
+      <w:r>
+        <w:t xml:space="preserve"> </w:t>
+      </w:r>
+      <w:r>
+        <w:t xml:space="preserve">windows. In every test the travel-time delays follow an assumed model rather than</w:t>
+      </w:r>
+      <w:r>
+        <w:t xml:space="preserve"> </w:t>
+      </w:r>
+      <w:r>
+        <w:t xml:space="preserve">measured traffic data, so the study shows whether the procedure works under</w:t>
+      </w:r>
+      <w:r>
+        <w:t xml:space="preserve"> </w:t>
+      </w:r>
+      <w:r>
+        <w:t xml:space="preserve">controlled conditions, not how a particular fleet would perform.</w:t>
       </w:r>
     </w:p>
     <w:bookmarkEnd w:id="29"/>
@@ -3022,7 +3046,7 @@
     </w:p>
     <w:bookmarkEnd w:id="45"/>
     <w:bookmarkEnd w:id="46"/>
-    <w:bookmarkStart w:id="62" w:name="methods"/>
+    <w:bookmarkStart w:id="63" w:name="methods"/>
     <w:p>
       <w:pPr>
         <w:pStyle w:val="Heading1"/>
@@ -4899,6 +4923,51 @@
         <w:t xml:space="preserve">.</w:t>
       </w:r>
     </w:p>
+    <w:p>
+      <w:pPr>
+        <w:pStyle w:val="BodyText"/>
+      </w:pPr>
+      <w:r>
+        <w:t xml:space="preserve">The main (capped) procedure plans its candidates at the normal speed with the</w:t>
+      </w:r>
+      <w:r>
+        <w:t xml:space="preserve"> </w:t>
+      </w:r>
+      <w:r>
+        <w:t xml:space="preserve">planner’s weighted objective. A second version,</w:t>
+      </w:r>
+      <w:r>
+        <w:t xml:space="preserve"> </w:t>
+      </w:r>
+      <w:r>
+        <w:rPr>
+          <w:iCs/>
+          <w:i/>
+        </w:rPr>
+        <w:t xml:space="preserve">screened conservative</w:t>
+      </w:r>
+      <w:r>
+        <w:t xml:space="preserve">,</w:t>
+      </w:r>
+      <w:r>
+        <w:t xml:space="preserve"> </w:t>
+      </w:r>
+      <w:r>
+        <w:t xml:space="preserve">combines the screen with padding: it plans the candidates at the 20% padded speed</w:t>
+      </w:r>
+      <w:r>
+        <w:t xml:space="preserve"> </w:t>
+      </w:r>
+      <w:r>
+        <w:t xml:space="preserve">for the shortest distance, keeps the passing candidate with the shortest distance,</w:t>
+      </w:r>
+      <w:r>
+        <w:t xml:space="preserve"> </w:t>
+      </w:r>
+      <w:r>
+        <w:t xml:space="preserve">and falls back to the 20% padded plan when no candidate passes.</w:t>
+      </w:r>
+    </w:p>
     <w:bookmarkEnd w:id="55"/>
     <w:bookmarkStart w:id="57" w:name="keeping-every-customer-reachable"/>
     <w:p>
@@ -6727,7 +6796,7 @@
       </w:r>
     </w:p>
     <w:bookmarkEnd w:id="59"/>
-    <w:bookmarkStart w:id="60" w:name="instances-and-statistics"/>
+    <w:bookmarkStart w:id="61" w:name="instances-and-statistics"/>
     <w:p>
       <w:pPr>
         <w:pStyle w:val="Heading2"/>
@@ -6921,8 +6990,172 @@
         <w:t xml:space="preserve">starting at 06:00, and the same delay model was added. This check was exploratory.</w:t>
       </w:r>
     </w:p>
-    <w:bookmarkEnd w:id="60"/>
-    <w:bookmarkStart w:id="61" w:name="confirmatory-studies"/>
+    <w:p>
+      <w:pPr>
+        <w:pStyle w:val="BodyText"/>
+      </w:pPr>
+      <w:r>
+        <w:t xml:space="preserve">The second external check uses real delivery routes from the public data set of</w:t>
+      </w:r>
+      <w:r>
+        <w:t xml:space="preserve"> </w:t>
+      </w:r>
+      <w:r>
+        <w:t xml:space="preserve">the 2021 Amazon Last Mile Routing Research Challenge</w:t>
+      </w:r>
+      <w:r>
+        <w:t xml:space="preserve"> </w:t>
+      </w:r>
+      <w:r>
+        <w:t xml:space="preserve">((D. Merchán, J. Arora, J. Pachon, K. Konduri, M. Winkenbach, S. Parks and J. Noszek. 2021</w:t>
+      </w:r>
+      <w:r>
+        <w:t xml:space="preserve"> </w:t>
+      </w:r>
+      <w:r>
+        <w:t xml:space="preserve">Amazon</w:t>
+      </w:r>
+      <w:r>
+        <w:t xml:space="preserve"> </w:t>
+      </w:r>
+      <w:r>
+        <w:t xml:space="preserve">last mile routing research challenge: Data set.</w:t>
+      </w:r>
+      <w:r>
+        <w:t xml:space="preserve"> </w:t>
+      </w:r>
+      <w:r>
+        <w:rPr>
+          <w:iCs/>
+          <w:i/>
+        </w:rPr>
+        <w:t xml:space="preserve">Transp Sci</w:t>
+      </w:r>
+      <w:r>
+        <w:t xml:space="preserve">., 2022,</w:t>
+      </w:r>
+      <w:r>
+        <w:t xml:space="preserve"> </w:t>
+      </w:r>
+      <w:hyperlink r:id="rId60">
+        <w:r>
+          <w:rPr>
+            <w:rStyle w:val="Hyperlink"/>
+          </w:rPr>
+          <w:t xml:space="preserve">https://doi.org/10.1287/trsc.2022.1173</w:t>
+        </w:r>
+      </w:hyperlink>
+      <w:r>
+        <w:t xml:space="preserve">))</w:t>
+      </w:r>
+      <w:r>
+        <w:t xml:space="preserve">. The 40 routes</w:t>
+      </w:r>
+      <w:r>
+        <w:t xml:space="preserve"> </w:t>
+      </w:r>
+      <w:r>
+        <w:t xml:space="preserve">that Amazon rated as high quality were drawn with a fixed seed from</w:t>
+      </w:r>
+      <w:r>
+        <w:t xml:space="preserve"> </w:t>
+      </w:r>
+      <w:r>
+        <w:t xml:space="preserve">17 depots in five US cities; each is one van’s day, with</w:t>
+      </w:r>
+      <w:r>
+        <w:t xml:space="preserve"> </w:t>
+      </w:r>
+      <w:r>
+        <w:t xml:space="preserve">80 to 194 stops (median 150). The data give the</w:t>
+      </w:r>
+      <w:r>
+        <w:t xml:space="preserve"> </w:t>
+      </w:r>
+      <w:r>
+        <w:t xml:space="preserve">travel time between every pair of stops, the planned service time and volume of</w:t>
+      </w:r>
+      <w:r>
+        <w:t xml:space="preserve"> </w:t>
+      </w:r>
+      <w:r>
+        <w:t xml:space="preserve">every package, the van’s capacity, its departure time and the order the driver</w:t>
+      </w:r>
+      <w:r>
+        <w:t xml:space="preserve"> </w:t>
+      </w:r>
+      <w:r>
+        <w:t xml:space="preserve">actually drove. Consecutive stops in the same Amazon delivery zone were joined into</w:t>
+      </w:r>
+      <w:r>
+        <w:t xml:space="preserve"> </w:t>
+      </w:r>
+      <w:r>
+        <w:t xml:space="preserve">one customer, giving 10 to 36 customers per route; the</w:t>
+      </w:r>
+      <w:r>
+        <w:t xml:space="preserve"> </w:t>
+      </w:r>
+      <w:r>
+        <w:t xml:space="preserve">solver rounds every trip up to a whole minute, and on single stops a few hundred</w:t>
+      </w:r>
+      <w:r>
+        <w:t xml:space="preserve"> </w:t>
+      </w:r>
+      <w:r>
+        <w:t xml:space="preserve">metres apart that rounding alone would add more than an hour per route. A</w:t>
+      </w:r>
+      <w:r>
+        <w:t xml:space="preserve"> </w:t>
+      </w:r>
+      <w:r>
+        <w:t xml:space="preserve">customer’s service time (its packages plus the walking and driving between its</w:t>
+      </w:r>
+      <w:r>
+        <w:t xml:space="preserve"> </w:t>
+      </w:r>
+      <w:r>
+        <w:t xml:space="preserve">stops) was added to the trips leaving it, so it receives the same random delays as</w:t>
+      </w:r>
+      <w:r>
+        <w:t xml:space="preserve"> </w:t>
+      </w:r>
+      <w:r>
+        <w:t xml:space="preserve">driving. In Amazon’s data only 7% of these stops have a delivery window,</w:t>
+      </w:r>
+      <w:r>
+        <w:t xml:space="preserve"> </w:t>
+      </w:r>
+      <w:r>
+        <w:t xml:space="preserve">and the middle half of those windows are 7 to 8 hours wide, so each customer was offered a two-hour window containing the time the</w:t>
+      </w:r>
+      <w:r>
+        <w:t xml:space="preserve"> </w:t>
+      </w:r>
+      <w:r>
+        <w:t xml:space="preserve">driver actually arrived, placed at random around it. The shift starts at the real</w:t>
+      </w:r>
+      <w:r>
+        <w:t xml:space="preserve"> </w:t>
+      </w:r>
+      <w:r>
+        <w:t xml:space="preserve">local departure time, lasts 1.3 times the actual route, and up to three vans of the</w:t>
+      </w:r>
+      <w:r>
+        <w:t xml:space="preserve"> </w:t>
+      </w:r>
+      <w:r>
+        <w:t xml:space="preserve">real capacity may be used. The unchanged OR-Tools pipeline was run on each route.</w:t>
+      </w:r>
+      <w:r>
+        <w:t xml:space="preserve"> </w:t>
+      </w:r>
+      <w:r>
+        <w:t xml:space="preserve">This check was also exploratory.</w:t>
+      </w:r>
+    </w:p>
+    <w:bookmarkEnd w:id="61"/>
+    <w:bookmarkStart w:id="62" w:name="confirmatory-studies"/>
     <w:p>
       <w:pPr>
         <w:pStyle w:val="Heading2"/>
@@ -7032,9 +7265,9 @@
         <w:t xml:space="preserve">of a false confirmation stays below 5% for each pair.</w:t>
       </w:r>
     </w:p>
-    <w:bookmarkEnd w:id="61"/>
     <w:bookmarkEnd w:id="62"/>
-    <w:bookmarkStart w:id="80" w:name="results"/>
+    <w:bookmarkEnd w:id="63"/>
+    <w:bookmarkStart w:id="83" w:name="results"/>
     <w:p>
       <w:pPr>
         <w:pStyle w:val="Heading1"/>
@@ -7043,7 +7276,7 @@
         <w:t xml:space="preserve">Results</w:t>
       </w:r>
     </w:p>
-    <w:bookmarkStart w:id="67" w:name="screening-beats-20-padding"/>
+    <w:bookmarkStart w:id="68" w:name="screening-beats-20-padding"/>
     <w:p>
       <w:pPr>
         <w:pStyle w:val="Heading2"/>
@@ -7223,7 +7456,7 @@
         <w:t xml:space="preserve">).</w:t>
       </w:r>
     </w:p>
-    <w:bookmarkStart w:id="63" w:name="tab:paired"/>
+    <w:bookmarkStart w:id="64" w:name="tab:paired"/>
     <w:p>
       <w:pPr>
         <w:pStyle w:val="TableCaption"/>
@@ -7645,7 +7878,7 @@
         </w:tc>
       </w:tr>
     </w:tbl>
-    <w:bookmarkEnd w:id="63"/>
+    <w:bookmarkEnd w:id="64"/>
     <w:p>
       <w:pPr>
         <w:pStyle w:val="CaptionedFigure"/>
@@ -7655,18 +7888,18 @@
           <wp:inline>
             <wp:extent cx="4533900" cy="2566541"/>
             <wp:effectExtent b="0" l="0" r="0" t="0"/>
-            <wp:docPr descr="" title="" id="65" name="Picture"/>
+            <wp:docPr descr="" title="" id="66" name="Picture"/>
             <a:graphic>
               <a:graphicData uri="http://schemas.openxmlformats.org/drawingml/2006/picture">
                 <pic:pic>
                   <pic:nvPicPr>
-                    <pic:cNvPr descr="Fig1.png" id="66" name="Picture"/>
+                    <pic:cNvPr descr="Fig1.png" id="67" name="Picture"/>
                     <pic:cNvPicPr>
                       <a:picLocks noChangeArrowheads="1" noChangeAspect="1"/>
                     </pic:cNvPicPr>
                   </pic:nvPicPr>
                   <pic:blipFill>
-                    <a:blip r:embed="rId64"/>
+                    <a:blip r:embed="rId65"/>
                     <a:stretch>
                       <a:fillRect/>
                     </a:stretch>
@@ -7747,8 +7980,8 @@
         <w:t xml:space="preserve">bars are 95% bootstrap intervals over instances.</w:t>
       </w:r>
     </w:p>
-    <w:bookmarkEnd w:id="67"/>
-    <w:bookmarkStart w:id="72" w:name="padding-at-other-levels"/>
+    <w:bookmarkEnd w:id="68"/>
+    <w:bookmarkStart w:id="73" w:name="padding-at-other-levels"/>
     <w:p>
       <w:pPr>
         <w:pStyle w:val="Heading2"/>
@@ -7936,7 +8169,7 @@
         <w:t xml:space="preserve">had a plan, so its extra reliability costs only a few percent of distance.</w:t>
       </w:r>
     </w:p>
-    <w:bookmarkStart w:id="68" w:name="tab:padding"/>
+    <w:bookmarkStart w:id="69" w:name="tab:padding"/>
     <w:p>
       <w:pPr>
         <w:pStyle w:val="TableCaption"/>
@@ -8943,7 +9176,7 @@
         </w:tc>
       </w:tr>
     </w:tbl>
-    <w:bookmarkEnd w:id="68"/>
+    <w:bookmarkEnd w:id="69"/>
     <w:p>
       <w:pPr>
         <w:pStyle w:val="CaptionedFigure"/>
@@ -8953,18 +9186,18 @@
           <wp:inline>
             <wp:extent cx="4533900" cy="2692003"/>
             <wp:effectExtent b="0" l="0" r="0" t="0"/>
-            <wp:docPr descr="" title="" id="70" name="Picture"/>
+            <wp:docPr descr="" title="" id="71" name="Picture"/>
             <a:graphic>
               <a:graphicData uri="http://schemas.openxmlformats.org/drawingml/2006/picture">
                 <pic:pic>
                   <pic:nvPicPr>
-                    <pic:cNvPr descr="FigPadding.png" id="71" name="Picture"/>
+                    <pic:cNvPr descr="FigPadding.png" id="72" name="Picture"/>
                     <pic:cNvPicPr>
                       <a:picLocks noChangeArrowheads="1" noChangeAspect="1"/>
                     </pic:cNvPicPr>
                   </pic:nvPicPr>
                   <pic:blipFill>
-                    <a:blip r:embed="rId69"/>
+                    <a:blip r:embed="rId70"/>
                     <a:stretch>
                       <a:fillRect/>
                     </a:stretch>
@@ -9023,8 +9256,8 @@
         <w:t xml:space="preserve">procedure over all instances with its 95% bootstrap interval.</w:t>
       </w:r>
     </w:p>
-    <w:bookmarkEnd w:id="72"/>
-    <w:bookmarkStart w:id="74" w:name="the-cap-removes-most-failures"/>
+    <w:bookmarkEnd w:id="73"/>
+    <w:bookmarkStart w:id="75" w:name="the-cap-removes-most-failures"/>
     <w:p>
       <w:pPr>
         <w:pStyle w:val="Heading2"/>
@@ -9112,7 +9345,7 @@
         <w:t xml:space="preserve">days, which shows that the screen rarely admits a plan that later disappoints.</w:t>
       </w:r>
     </w:p>
-    <w:bookmarkStart w:id="73" w:name="tab:screen"/>
+    <w:bookmarkStart w:id="74" w:name="tab:screen"/>
     <w:p>
       <w:pPr>
         <w:pStyle w:val="TableCaption"/>
@@ -9623,7 +9856,7 @@
         </w:tc>
       </w:tr>
     </w:tbl>
-    <w:bookmarkEnd w:id="73"/>
+    <w:bookmarkEnd w:id="74"/>
     <w:p>
       <w:pPr>
         <w:pStyle w:val="BodyText"/>
@@ -9650,8 +9883,8 @@
         <w:t xml:space="preserve">11 fallback plans averaged 45.2%.</w:t>
       </w:r>
     </w:p>
-    <w:bookmarkEnd w:id="74"/>
-    <w:bookmarkStart w:id="76" w:name="standard-benchmark-instances"/>
+    <w:bookmarkEnd w:id="75"/>
+    <w:bookmarkStart w:id="77" w:name="standard-benchmark-instances"/>
     <w:p>
       <w:pPr>
         <w:pStyle w:val="Heading2"/>
@@ -9721,7 +9954,7 @@
         <w:t xml:space="preserve">benchmark instances is close to the one on the synthetic instances.</w:t>
       </w:r>
     </w:p>
-    <w:bookmarkStart w:id="75" w:name="tab:gh"/>
+    <w:bookmarkStart w:id="76" w:name="tab:gh"/>
     <w:p>
       <w:pPr>
         <w:pStyle w:val="TableCaption"/>
@@ -10009,15 +10242,15 @@
         </w:tc>
       </w:tr>
     </w:tbl>
-    <w:bookmarkEnd w:id="75"/>
     <w:bookmarkEnd w:id="76"/>
-    <w:bookmarkStart w:id="78" w:name="confirmatory-studies-1"/>
+    <w:bookmarkEnd w:id="77"/>
+    <w:bookmarkStart w:id="79" w:name="real-delivery-routes"/>
     <w:p>
       <w:pPr>
         <w:pStyle w:val="Heading2"/>
       </w:pPr>
       <w:r>
-        <w:t xml:space="preserve">Confirmatory studies</w:t>
+        <w:t xml:space="preserve">Real delivery routes</w:t>
       </w:r>
     </w:p>
     <w:p>
@@ -10025,9 +10258,15 @@
         <w:pStyle w:val="FirstParagraph"/>
       </w:pPr>
       <w:r>
-        <w:t xml:space="preserve">Table </w:t>
-      </w:r>
-      <w:hyperlink w:anchor="tab:primaries">
+        <w:t xml:space="preserve">On the Amazon routes, both screened procedures were more reliable than 20%</w:t>
+      </w:r>
+      <w:r>
+        <w:t xml:space="preserve"> </w:t>
+      </w:r>
+      <w:r>
+        <w:t xml:space="preserve">padding (Table </w:t>
+      </w:r>
+      <w:hyperlink w:anchor="tab:amazon">
         <w:r>
           <w:rPr>
             <w:rStyle w:val="Hyperlink"/>
@@ -10036,6 +10275,440 @@
         </w:r>
       </w:hyperlink>
       <w:r>
+        <w:t xml:space="preserve">). Screened conservative pooled 75.3% against</w:t>
+      </w:r>
+      <w:r>
+        <w:t xml:space="preserve"> </w:t>
+      </w:r>
+      <w:r>
+        <w:t xml:space="preserve">59.0% for padding, a difference of 16.3 [11.0, 22.2]</w:t>
+      </w:r>
+      <w:r>
+        <w:t xml:space="preserve"> </w:t>
+      </w:r>
+      <w:r>
+        <w:t xml:space="preserve">points, and the capped procedure pooled 72.6%, 13.6 [3.9,</w:t>
+      </w:r>
+      <w:r>
+        <w:t xml:space="preserve"> </w:t>
+      </w:r>
+      <w:r>
+        <w:t xml:space="preserve">24.4] points above padding. Part of the gap comes from planning: padding</w:t>
+      </w:r>
+      <w:r>
+        <w:t xml:space="preserve"> </w:t>
+      </w:r>
+      <w:r>
+        <w:t xml:space="preserve">found no plan on 12 routes, against</w:t>
+      </w:r>
+      <w:r>
+        <w:t xml:space="preserve"> </w:t>
+      </w:r>
+      <w:r>
+        <w:t xml:space="preserve">6 for the other configurations. Where the capped procedure admitted a</w:t>
+      </w:r>
+      <w:r>
+        <w:t xml:space="preserve"> </w:t>
+      </w:r>
+      <w:r>
+        <w:t xml:space="preserve">plan (24 routes), its validated service averaged 97.4%,</w:t>
+      </w:r>
+      <w:r>
+        <w:t xml:space="preserve"> </w:t>
+      </w:r>
+      <w:r>
+        <w:t xml:space="preserve">and on 23 of them it was at least 95%. On the</w:t>
+      </w:r>
+      <w:r>
+        <w:t xml:space="preserve"> </w:t>
+      </w:r>
+      <w:r>
+        <w:t xml:space="preserve">10 routes where no candidate passed, its fallback averaged</w:t>
+      </w:r>
+      <w:r>
+        <w:t xml:space="preserve"> </w:t>
+      </w:r>
+      <w:r>
+        <w:t xml:space="preserve">56.8% against 62.9% for padding, and on the</w:t>
+      </w:r>
+      <w:r>
+        <w:t xml:space="preserve"> </w:t>
+      </w:r>
+      <w:r>
+        <w:t xml:space="preserve">28 routes where both had a plan the two were not distinguishable</w:t>
+      </w:r>
+      <w:r>
+        <w:t xml:space="preserve"> </w:t>
+      </w:r>
+      <w:r>
+        <w:t xml:space="preserve">(1.6 [</w:t>
+      </w:r>
+      <m:oMath>
+        <m:r>
+          <m:rPr>
+            <m:sty m:val="p"/>
+          </m:rPr>
+          <m:t>−</m:t>
+        </m:r>
+      </m:oMath>
+      <w:r>
+        <w:t xml:space="preserve">4.4, 7.2] points). Screened conservative</w:t>
+      </w:r>
+      <w:r>
+        <w:t xml:space="preserve"> </w:t>
+      </w:r>
+      <w:r>
+        <w:t xml:space="preserve">avoids that weakness because its fallback is the padded plan. On 6 routes</w:t>
+      </w:r>
+      <w:r>
+        <w:t xml:space="preserve"> </w:t>
+      </w:r>
+      <w:r>
+        <w:t xml:space="preserve">with 22 to 36 customers no configuration found a plan within the time limit, even</w:t>
+      </w:r>
+      <w:r>
+        <w:t xml:space="preserve"> </w:t>
+      </w:r>
+      <w:r>
+        <w:t xml:space="preserve">though the driver’s own order is feasible by construction, so these failures are</w:t>
+      </w:r>
+      <w:r>
+        <w:t xml:space="preserve"> </w:t>
+      </w:r>
+      <w:r>
+        <w:t xml:space="preserve">limits of the solver’s search, not of the instances.</w:t>
+      </w:r>
+    </w:p>
+    <w:bookmarkStart w:id="78" w:name="tab:amazon"/>
+    <w:p>
+      <w:pPr>
+        <w:pStyle w:val="TableCaption"/>
+      </w:pPr>
+      <w:r>
+        <w:t xml:space="preserve">Real delivery routes: 40 Amazon routes from five US cities (exploratory).</w:t>
+      </w:r>
+      <w:r>
+        <w:t xml:space="preserve"> </w:t>
+      </w:r>
+      <w:r>
+        <w:rPr>
+          <w:iCs/>
+          <w:i/>
+        </w:rPr>
+        <w:t xml:space="preserve">Plans</w:t>
+      </w:r>
+      <w:r>
+        <w:t xml:space="preserve">: routes on which the configuration produced a plan;</w:t>
+      </w:r>
+      <w:r>
+        <w:t xml:space="preserve"> </w:t>
+      </w:r>
+      <w:r>
+        <w:rPr>
+          <w:iCs/>
+          <w:i/>
+        </w:rPr>
+        <w:t xml:space="preserve">Admitted</w:t>
+      </w:r>
+      <w:r>
+        <w:t xml:space="preserve">: routes on which a candidate passed the screen. Pooled validated service probability (%) with a 95% bootstrap interval over routes; a route without a plan scores zero.</w:t>
+      </w:r>
+    </w:p>
+    <w:tbl>
+      <w:tblPr>
+        <w:tblStyle w:val="Table"/>
+        <w:tblW w:type="auto" w:w="0"/>
+        <w:tblLook w:firstRow="1" w:lastRow="0" w:firstColumn="0" w:lastColumn="0" w:noHBand="0" w:noVBand="0" w:val="0020"/>
+        <w:jc w:val="start"/>
+        <w:tblCaption w:val="Real delivery routes: 40 Amazon routes from five US cities (exploratory). Plans: routes on which the configuration produced a plan; Admitted: routes on which a candidate passed the screen. Pooled validated service probability (%) with a 95% bootstrap interval over routes; a route without a plan scores zero."/>
+      </w:tblPr>
+      <w:tblGrid>
+        <w:gridCol w:w="1980"/>
+        <w:gridCol w:w="1980"/>
+        <w:gridCol w:w="1980"/>
+        <w:gridCol w:w="1980"/>
+      </w:tblGrid>
+      <w:tr>
+        <w:trPr>
+          <w:tblHeader w:val="true"/>
+        </w:trPr>
+        <w:tc>
+          <w:tcPr/>
+          <w:p>
+            <w:pPr>
+              <w:pStyle w:val="Compact"/>
+              <w:jc w:val="left"/>
+            </w:pPr>
+            <w:r>
+              <w:t xml:space="preserve">Configuration</w:t>
+            </w:r>
+          </w:p>
+        </w:tc>
+        <w:tc>
+          <w:tcPr/>
+          <w:p>
+            <w:pPr>
+              <w:pStyle w:val="Compact"/>
+              <w:jc w:val="center"/>
+            </w:pPr>
+            <w:r>
+              <w:t xml:space="preserve">Plans</w:t>
+            </w:r>
+          </w:p>
+        </w:tc>
+        <w:tc>
+          <w:tcPr/>
+          <w:p>
+            <w:pPr>
+              <w:pStyle w:val="Compact"/>
+              <w:jc w:val="center"/>
+            </w:pPr>
+            <w:r>
+              <w:t xml:space="preserve">Admitted</w:t>
+            </w:r>
+          </w:p>
+        </w:tc>
+        <w:tc>
+          <w:tcPr/>
+          <w:p>
+            <w:pPr>
+              <w:pStyle w:val="Compact"/>
+              <w:jc w:val="left"/>
+            </w:pPr>
+            <w:r>
+              <w:t xml:space="preserve">Pooled service</w:t>
+            </w:r>
+          </w:p>
+        </w:tc>
+      </w:tr>
+      <w:tr>
+        <w:tc>
+          <w:tcPr/>
+          <w:p>
+            <w:pPr>
+              <w:pStyle w:val="Compact"/>
+              <w:jc w:val="left"/>
+            </w:pPr>
+            <w:r>
+              <w:t xml:space="preserve">Nominal plan (no protection)</w:t>
+            </w:r>
+          </w:p>
+        </w:tc>
+        <w:tc>
+          <w:tcPr/>
+          <w:p>
+            <w:pPr>
+              <w:pStyle w:val="Compact"/>
+              <w:jc w:val="center"/>
+            </w:pPr>
+            <w:r>
+              <w:t xml:space="preserve">34/40</w:t>
+            </w:r>
+          </w:p>
+        </w:tc>
+        <w:tc>
+          <w:tcPr/>
+          <w:p>
+            <w:pPr>
+              <w:pStyle w:val="Compact"/>
+              <w:jc w:val="center"/>
+            </w:pPr>
+            <w:r>
+              <w:t xml:space="preserve">–</w:t>
+            </w:r>
+          </w:p>
+        </w:tc>
+        <w:tc>
+          <w:tcPr/>
+          <w:p>
+            <w:pPr>
+              <w:pStyle w:val="Compact"/>
+              <w:jc w:val="left"/>
+            </w:pPr>
+            <w:r>
+              <w:t xml:space="preserve">41.4 [35.1, 47.1]</w:t>
+            </w:r>
+          </w:p>
+        </w:tc>
+      </w:tr>
+      <w:tr>
+        <w:tc>
+          <w:tcPr/>
+          <w:p>
+            <w:pPr>
+              <w:pStyle w:val="Compact"/>
+              <w:jc w:val="left"/>
+            </w:pPr>
+            <w:r>
+              <w:t xml:space="preserve">20% padding</w:t>
+            </w:r>
+          </w:p>
+        </w:tc>
+        <w:tc>
+          <w:tcPr/>
+          <w:p>
+            <w:pPr>
+              <w:pStyle w:val="Compact"/>
+              <w:jc w:val="center"/>
+            </w:pPr>
+            <w:r>
+              <w:t xml:space="preserve">28/40</w:t>
+            </w:r>
+          </w:p>
+        </w:tc>
+        <w:tc>
+          <w:tcPr/>
+          <w:p>
+            <w:pPr>
+              <w:pStyle w:val="Compact"/>
+              <w:jc w:val="center"/>
+            </w:pPr>
+            <w:r>
+              <w:t xml:space="preserve">–</w:t>
+            </w:r>
+          </w:p>
+        </w:tc>
+        <w:tc>
+          <w:tcPr/>
+          <w:p>
+            <w:pPr>
+              <w:pStyle w:val="Compact"/>
+              <w:jc w:val="left"/>
+            </w:pPr>
+            <w:r>
+              <w:t xml:space="preserve">59.0 [46.6, 70.8]</w:t>
+            </w:r>
+          </w:p>
+        </w:tc>
+      </w:tr>
+      <w:tr>
+        <w:tc>
+          <w:tcPr/>
+          <w:p>
+            <w:pPr>
+              <w:pStyle w:val="Compact"/>
+              <w:jc w:val="left"/>
+            </w:pPr>
+            <w:r>
+              <w:t xml:space="preserve">Capped screening procedure</w:t>
+            </w:r>
+          </w:p>
+        </w:tc>
+        <w:tc>
+          <w:tcPr/>
+          <w:p>
+            <w:pPr>
+              <w:pStyle w:val="Compact"/>
+              <w:jc w:val="center"/>
+            </w:pPr>
+            <w:r>
+              <w:t xml:space="preserve">34/40</w:t>
+            </w:r>
+          </w:p>
+        </w:tc>
+        <w:tc>
+          <w:tcPr/>
+          <w:p>
+            <w:pPr>
+              <w:pStyle w:val="Compact"/>
+              <w:jc w:val="center"/>
+            </w:pPr>
+            <w:r>
+              <w:t xml:space="preserve">24</w:t>
+            </w:r>
+          </w:p>
+        </w:tc>
+        <w:tc>
+          <w:tcPr/>
+          <w:p>
+            <w:pPr>
+              <w:pStyle w:val="Compact"/>
+              <w:jc w:val="left"/>
+            </w:pPr>
+            <w:r>
+              <w:t xml:space="preserve">72.6 [61.2, 82.9]</w:t>
+            </w:r>
+          </w:p>
+        </w:tc>
+      </w:tr>
+      <w:tr>
+        <w:tc>
+          <w:tcPr/>
+          <w:p>
+            <w:pPr>
+              <w:pStyle w:val="Compact"/>
+              <w:jc w:val="left"/>
+            </w:pPr>
+            <w:r>
+              <w:t xml:space="preserve">Screened conservative</w:t>
+            </w:r>
+          </w:p>
+        </w:tc>
+        <w:tc>
+          <w:tcPr/>
+          <w:p>
+            <w:pPr>
+              <w:pStyle w:val="Compact"/>
+              <w:jc w:val="center"/>
+            </w:pPr>
+            <w:r>
+              <w:t xml:space="preserve">34/40</w:t>
+            </w:r>
+          </w:p>
+        </w:tc>
+        <w:tc>
+          <w:tcPr/>
+          <w:p>
+            <w:pPr>
+              <w:pStyle w:val="Compact"/>
+              <w:jc w:val="center"/>
+            </w:pPr>
+            <w:r>
+              <w:t xml:space="preserve">25</w:t>
+            </w:r>
+          </w:p>
+        </w:tc>
+        <w:tc>
+          <w:tcPr/>
+          <w:p>
+            <w:pPr>
+              <w:pStyle w:val="Compact"/>
+              <w:jc w:val="left"/>
+            </w:pPr>
+            <w:r>
+              <w:t xml:space="preserve">75.3 [63.6, 85.7]</w:t>
+            </w:r>
+          </w:p>
+        </w:tc>
+      </w:tr>
+    </w:tbl>
+    <w:bookmarkEnd w:id="78"/>
+    <w:bookmarkEnd w:id="79"/>
+    <w:bookmarkStart w:id="81" w:name="confirmatory-studies-1"/>
+    <w:p>
+      <w:pPr>
+        <w:pStyle w:val="Heading2"/>
+      </w:pPr>
+      <w:r>
+        <w:t xml:space="preserve">Confirmatory studies</w:t>
+      </w:r>
+    </w:p>
+    <w:p>
+      <w:pPr>
+        <w:pStyle w:val="FirstParagraph"/>
+      </w:pPr>
+      <w:r>
+        <w:t xml:space="preserve">Table </w:t>
+      </w:r>
+      <w:hyperlink w:anchor="tab:primaries">
+        <w:r>
+          <w:rPr>
+            <w:rStyle w:val="Hyperlink"/>
+          </w:rPr>
+          <w:t xml:space="preserve">6</w:t>
+        </w:r>
+      </w:hyperlink>
+      <w:r>
         <w:t xml:space="preserve"> </w:t>
       </w:r>
       <w:r>
@@ -10096,7 +10769,7 @@
         <w:t xml:space="preserve">solvers, to 94.4% and 94.9%.</w:t>
       </w:r>
     </w:p>
-    <w:bookmarkStart w:id="77" w:name="tab:primaries"/>
+    <w:bookmarkStart w:id="80" w:name="tab:primaries"/>
     <w:p>
       <w:pPr>
         <w:pStyle w:val="TableCaption"/>
@@ -10689,9 +11362,9 @@
         </w:tc>
       </w:tr>
     </w:tbl>
-    <w:bookmarkEnd w:id="77"/>
-    <w:bookmarkEnd w:id="78"/>
-    <w:bookmarkStart w:id="79" w:name="comparison-with-robust-optimization"/>
+    <w:bookmarkEnd w:id="80"/>
+    <w:bookmarkEnd w:id="81"/>
+    <w:bookmarkStart w:id="82" w:name="comparison-with-robust-optimization"/>
     <w:p>
       <w:pPr>
         <w:pStyle w:val="Heading2"/>
@@ -10742,7 +11415,7 @@
           <w:rPr>
             <w:rStyle w:val="Hyperlink"/>
           </w:rPr>
-          <w:t xml:space="preserve">5</w:t>
+          <w:t xml:space="preserve">6</w:t>
         </w:r>
       </w:hyperlink>
       <w:r>
@@ -10773,9 +11446,9 @@
         <w:t xml:space="preserve">planner tested; its strength is that it works with any existing solver.</w:t>
       </w:r>
     </w:p>
-    <w:bookmarkEnd w:id="79"/>
-    <w:bookmarkEnd w:id="80"/>
-    <w:bookmarkStart w:id="85" w:name="discussion"/>
+    <w:bookmarkEnd w:id="82"/>
+    <w:bookmarkEnd w:id="83"/>
+    <w:bookmarkStart w:id="88" w:name="discussion"/>
     <w:p>
       <w:pPr>
         <w:pStyle w:val="Heading1"/>
@@ -10784,7 +11457,7 @@
         <w:t xml:space="preserve">Discussion</w:t>
       </w:r>
     </w:p>
-    <w:bookmarkStart w:id="81" w:name="key-findings-and-implications"/>
+    <w:bookmarkStart w:id="84" w:name="key-findings-and-implications"/>
     <w:p>
       <w:pPr>
         <w:pStyle w:val="Heading2"/>
@@ -10861,8 +11534,8 @@
         <w:t xml:space="preserve">model.</w:t>
       </w:r>
     </w:p>
-    <w:bookmarkEnd w:id="81"/>
-    <w:bookmarkStart w:id="82" w:name="limitations"/>
+    <w:bookmarkEnd w:id="84"/>
+    <w:bookmarkStart w:id="85" w:name="limitations"/>
     <w:p>
       <w:pPr>
         <w:pStyle w:val="Heading2"/>
@@ -10888,13 +11561,19 @@
         <w:t xml:space="preserve"> </w:t>
       </w:r>
       <w:r>
-        <w:t xml:space="preserve">for a real fleet. The benchmark check shows the result is not specific to the</w:t>
-      </w:r>
-      <w:r>
-        <w:t xml:space="preserve"> </w:t>
-      </w:r>
-      <w:r>
-        <w:t xml:space="preserve">instance generator, but those instances are also artificial. The confirmatory studies show that the findings repeat on new</w:t>
+        <w:t xml:space="preserve">for a real fleet. The benchmark and Amazon checks show that the result is not specific to the</w:t>
+      </w:r>
+      <w:r>
+        <w:t xml:space="preserve"> </w:t>
+      </w:r>
+      <w:r>
+        <w:t xml:space="preserve">instance generator, but even the Amazon routes use assumed delivery windows and an</w:t>
+      </w:r>
+      <w:r>
+        <w:t xml:space="preserve"> </w:t>
+      </w:r>
+      <w:r>
+        <w:t xml:space="preserve">assumed delay model. The confirmatory studies show that the findings repeat on new</w:t>
       </w:r>
       <w:r>
         <w:t xml:space="preserve"> </w:t>
@@ -10945,8 +11624,8 @@
         <w:t xml:space="preserve">times, and breakdowns and same-day replanning are not modelled.</w:t>
       </w:r>
     </w:p>
-    <w:bookmarkEnd w:id="82"/>
-    <w:bookmarkStart w:id="83" w:name="recommendations"/>
+    <w:bookmarkEnd w:id="85"/>
+    <w:bookmarkStart w:id="86" w:name="recommendations"/>
     <w:p>
       <w:pPr>
         <w:pStyle w:val="Heading2"/>
@@ -10978,11 +11657,29 @@
         <w:t xml:space="preserve"> </w:t>
       </w:r>
       <w:r>
-        <w:t xml:space="preserve">travel-time data.</w:t>
+        <w:t xml:space="preserve">travel-time data. The Amazon routes also show that the fallback matters: when no</w:t>
+      </w:r>
+      <w:r>
+        <w:t xml:space="preserve"> </w:t>
+      </w:r>
+      <w:r>
+        <w:t xml:space="preserve">candidate passes, returning the padded plan is safer than returning the</w:t>
+      </w:r>
+      <w:r>
+        <w:t xml:space="preserve"> </w:t>
+      </w:r>
+      <w:r>
+        <w:t xml:space="preserve">unbuffered one, so a company adopting the screen should use the padded plan as its</w:t>
+      </w:r>
+      <w:r>
+        <w:t xml:space="preserve"> </w:t>
+      </w:r>
+      <w:r>
+        <w:t xml:space="preserve">fallback.</w:t>
       </w:r>
     </w:p>
-    <w:bookmarkEnd w:id="83"/>
-    <w:bookmarkStart w:id="84" w:name="closing-thought"/>
+    <w:bookmarkEnd w:id="86"/>
+    <w:bookmarkStart w:id="87" w:name="closing-thought"/>
     <w:p>
       <w:pPr>
         <w:pStyle w:val="Heading2"/>
@@ -11041,9 +11738,9 @@
         <w:t xml:space="preserve">reliability guarantee to the tools companies already use.</w:t>
       </w:r>
     </w:p>
-    <w:bookmarkEnd w:id="84"/>
-    <w:bookmarkEnd w:id="85"/>
-    <w:bookmarkStart w:id="86" w:name="ai-usage-disclosure"/>
+    <w:bookmarkEnd w:id="87"/>
+    <w:bookmarkEnd w:id="88"/>
+    <w:bookmarkStart w:id="89" w:name="ai-usage-disclosure"/>
     <w:p>
       <w:pPr>
         <w:pStyle w:val="Heading1"/>
@@ -11102,7 +11799,7 @@
         <w:t xml:space="preserve">the content.</w:t>
       </w:r>
     </w:p>
-    <w:bookmarkEnd w:id="86"/>
+    <w:bookmarkEnd w:id="89"/>
     <w:sectPr/>
   </w:body>
 </w:document>

</xml_diff>

<commit_message>
NYC taxi calibration of the delay model; Amazon routes under fitted delays
</commit_message>
<xml_diff>
--- a/paper_nhsjs/routing_model_nhsjs.docx
+++ b/paper_nhsjs/routing_model_nhsjs.docx
@@ -1341,43 +1341,103 @@
         <w:t xml:space="preserve"> </w:t>
       </w:r>
       <w:r>
+        <w:t xml:space="preserve">with</w:t>
+      </w:r>
+      <w:r>
+        <w:t xml:space="preserve"> </w:t>
+      </w:r>
+      <w:r>
+        <w:t xml:space="preserve">delays</w:t>
+      </w:r>
+      <w:r>
+        <w:t xml:space="preserve"> </w:t>
+      </w:r>
+      <w:r>
+        <w:t xml:space="preserve">assumed</w:t>
+      </w:r>
+      <w:r>
+        <w:t xml:space="preserve"> </w:t>
+      </w:r>
+      <w:r>
+        <w:t xml:space="preserve">or</w:t>
+      </w:r>
+      <w:r>
+        <w:t xml:space="preserve"> </w:t>
+      </w:r>
+      <w:r>
+        <w:t xml:space="preserve">fitted</w:t>
+      </w:r>
+      <w:r>
+        <w:t xml:space="preserve"> </w:t>
+      </w:r>
+      <w:r>
+        <w:t xml:space="preserve">to</w:t>
+      </w:r>
+      <w:r>
+        <w:t xml:space="preserve"> </w:t>
+      </w:r>
+      <w:r>
+        <w:t xml:space="preserve">6.2</w:t>
+      </w:r>
+      <w:r>
+        <w:t xml:space="preserve"> </w:t>
+      </w:r>
+      <w:r>
+        <w:t xml:space="preserve">million</w:t>
+      </w:r>
+      <w:r>
+        <w:t xml:space="preserve"> </w:t>
+      </w:r>
+      <w:r>
+        <w:t xml:space="preserve">New</w:t>
+      </w:r>
+      <w:r>
+        <w:t xml:space="preserve"> </w:t>
+      </w:r>
+      <w:r>
+        <w:t xml:space="preserve">York</w:t>
+      </w:r>
+      <w:r>
+        <w:t xml:space="preserve"> </w:t>
+      </w:r>
+      <w:r>
+        <w:t xml:space="preserve">taxi</w:t>
+      </w:r>
+      <w:r>
+        <w:t xml:space="preserve"> </w:t>
+      </w:r>
+      <w:r>
+        <w:t xml:space="preserve">trips,</w:t>
+      </w:r>
+      <w:r>
+        <w:t xml:space="preserve"> </w:t>
+      </w:r>
+      <w:r>
         <w:t xml:space="preserve">screening</w:t>
       </w:r>
       <w:r>
         <w:t xml:space="preserve"> </w:t>
       </w:r>
       <w:r>
-        <w:t xml:space="preserve">padded</w:t>
-      </w:r>
-      <w:r>
-        <w:t xml:space="preserve"> </w:t>
-      </w:r>
-      <w:r>
-        <w:t xml:space="preserve">plans</w:t>
-      </w:r>
-      <w:r>
-        <w:t xml:space="preserve"> </w:t>
-      </w:r>
-      <w:r>
-        <w:t xml:space="preserve">raised</w:t>
-      </w:r>
-      <w:r>
-        <w:t xml:space="preserve"> </w:t>
-      </w:r>
-      <w:r>
-        <w:t xml:space="preserve">service</w:t>
-      </w:r>
-      <w:r>
-        <w:t xml:space="preserve"> </w:t>
-      </w:r>
-      <w:r>
-        <w:t xml:space="preserve">from</w:t>
-      </w:r>
-      <w:r>
-        <w:t xml:space="preserve"> </w:t>
-      </w:r>
-      <w:r>
-        <w:t xml:space="preserve">59.0%</w:t>
+        <w:t xml:space="preserve">beat</w:t>
+      </w:r>
+      <w:r>
+        <w:t xml:space="preserve"> </w:t>
+      </w:r>
+      <w:r>
+        <w:t xml:space="preserve">padding</w:t>
+      </w:r>
+      <w:r>
+        <w:t xml:space="preserve"> </w:t>
+      </w:r>
+      <w:r>
+        <w:t xml:space="preserve">by</w:t>
+      </w:r>
+      <w:r>
+        <w:t xml:space="preserve"> </w:t>
+      </w:r>
+      <w:r>
+        <w:t xml:space="preserve">13.6</w:t>
       </w:r>
       <w:r>
         <w:t xml:space="preserve"> </w:t>
@@ -1389,7 +1449,13 @@
         <w:t xml:space="preserve"> </w:t>
       </w:r>
       <w:r>
-        <w:t xml:space="preserve">75.3%.</w:t>
+        <w:t xml:space="preserve">20.6</w:t>
+      </w:r>
+      <w:r>
+        <w:t xml:space="preserve"> </w:t>
+      </w:r>
+      <w:r>
+        <w:t xml:space="preserve">points.</w:t>
       </w:r>
       <w:r>
         <w:t xml:space="preserve"> </w:t>
@@ -1408,12 +1474,6 @@
       </w:r>
       <w:r>
         <w:t xml:space="preserve">eight</w:t>
-      </w:r>
-      <w:r>
-        <w:t xml:space="preserve"> </w:t>
-      </w:r>
-      <w:r>
-        <w:t xml:space="preserve">prespecified</w:t>
       </w:r>
       <w:r>
         <w:t xml:space="preserve"> </w:t>
@@ -1537,91 +1597,31 @@
         <w:t xml:space="preserve"> </w:t>
       </w:r>
       <w:r>
-        <w:t xml:space="preserve">the</w:t>
-      </w:r>
-      <w:r>
-        <w:t xml:space="preserve"> </w:t>
-      </w:r>
-      <w:r>
-        <w:t xml:space="preserve">planner.</w:t>
-      </w:r>
-      <w:r>
-        <w:t xml:space="preserve"> </w:t>
-      </w:r>
-      <w:r>
-        <w:t xml:space="preserve">The</w:t>
-      </w:r>
-      <w:r>
-        <w:t xml:space="preserve"> </w:t>
-      </w:r>
-      <w:r>
-        <w:t xml:space="preserve">delay</w:t>
-      </w:r>
-      <w:r>
-        <w:t xml:space="preserve"> </w:t>
-      </w:r>
-      <w:r>
-        <w:t xml:space="preserve">model</w:t>
-      </w:r>
-      <w:r>
-        <w:t xml:space="preserve"> </w:t>
-      </w:r>
-      <w:r>
-        <w:t xml:space="preserve">is</w:t>
-      </w:r>
-      <w:r>
-        <w:t xml:space="preserve"> </w:t>
-      </w:r>
-      <w:r>
-        <w:t xml:space="preserve">still</w:t>
-      </w:r>
-      <w:r>
-        <w:t xml:space="preserve"> </w:t>
-      </w:r>
-      <w:r>
-        <w:t xml:space="preserve">assumed</w:t>
-      </w:r>
-      <w:r>
-        <w:t xml:space="preserve"> </w:t>
-      </w:r>
-      <w:r>
-        <w:t xml:space="preserve">and</w:t>
-      </w:r>
-      <w:r>
-        <w:t xml:space="preserve"> </w:t>
-      </w:r>
-      <w:r>
-        <w:t xml:space="preserve">needs</w:t>
-      </w:r>
-      <w:r>
-        <w:t xml:space="preserve"> </w:t>
-      </w:r>
-      <w:r>
-        <w:t xml:space="preserve">testing</w:t>
-      </w:r>
-      <w:r>
-        <w:t xml:space="preserve"> </w:t>
-      </w:r>
-      <w:r>
-        <w:t xml:space="preserve">on</w:t>
-      </w:r>
-      <w:r>
-        <w:t xml:space="preserve"> </w:t>
-      </w:r>
-      <w:r>
-        <w:t xml:space="preserve">real</w:t>
-      </w:r>
-      <w:r>
-        <w:t xml:space="preserve"> </w:t>
-      </w:r>
-      <w:r>
-        <w:t xml:space="preserve">traffic</w:t>
-      </w:r>
-      <w:r>
-        <w:t xml:space="preserve"> </w:t>
-      </w:r>
-      <w:r>
-        <w:t xml:space="preserve">data.</w:t>
+        <w:t xml:space="preserve">it.</w:t>
+      </w:r>
+      <w:r>
+        <w:t xml:space="preserve"> </w:t>
+      </w:r>
+      <w:r>
+        <w:t xml:space="preserve">Delivery</w:t>
+      </w:r>
+      <w:r>
+        <w:t xml:space="preserve"> </w:t>
+      </w:r>
+      <w:r>
+        <w:t xml:space="preserve">windows</w:t>
+      </w:r>
+      <w:r>
+        <w:t xml:space="preserve"> </w:t>
+      </w:r>
+      <w:r>
+        <w:t xml:space="preserve">were</w:t>
+      </w:r>
+      <w:r>
+        <w:t xml:space="preserve"> </w:t>
+      </w:r>
+      <w:r>
+        <w:t xml:space="preserve">assumed.</w:t>
       </w:r>
     </w:p>
     <w:p>
@@ -2224,19 +2224,19 @@
         <w:t xml:space="preserve"> </w:t>
       </w:r>
       <w:r>
-        <w:t xml:space="preserve">windows. In every test the travel-time delays follow an assumed model rather than</w:t>
-      </w:r>
-      <w:r>
-        <w:t xml:space="preserve"> </w:t>
-      </w:r>
-      <w:r>
-        <w:t xml:space="preserve">measured traffic data, so the study shows whether the procedure works under</w:t>
-      </w:r>
-      <w:r>
-        <w:t xml:space="preserve"> </w:t>
-      </w:r>
-      <w:r>
-        <w:t xml:space="preserve">controlled conditions, not how a particular fleet would perform.</w:t>
+        <w:t xml:space="preserve">windows. The delay model is assumed in the main studies and fitted to New York taxi trips</w:t>
+      </w:r>
+      <w:r>
+        <w:t xml:space="preserve"> </w:t>
+      </w:r>
+      <w:r>
+        <w:t xml:space="preserve">in the Amazon test, so the study shows whether the procedure works under</w:t>
+      </w:r>
+      <w:r>
+        <w:t xml:space="preserve"> </w:t>
+      </w:r>
+      <w:r>
+        <w:t xml:space="preserve">realistic conditions, not how a particular fleet would perform.</w:t>
       </w:r>
     </w:p>
     <w:bookmarkEnd w:id="29"/>
@@ -3046,7 +3046,7 @@
     </w:p>
     <w:bookmarkEnd w:id="45"/>
     <w:bookmarkEnd w:id="46"/>
-    <w:bookmarkStart w:id="63" w:name="methods"/>
+    <w:bookmarkStart w:id="64" w:name="methods"/>
     <w:p>
       <w:pPr>
         <w:pStyle w:val="Heading1"/>
@@ -6796,7 +6796,7 @@
       </w:r>
     </w:p>
     <w:bookmarkEnd w:id="59"/>
-    <w:bookmarkStart w:id="61" w:name="instances-and-statistics"/>
+    <w:bookmarkStart w:id="62" w:name="instances-and-statistics"/>
     <w:p>
       <w:pPr>
         <w:pStyle w:val="Heading2"/>
@@ -7154,8 +7154,169 @@
         <w:t xml:space="preserve">This check was also exploratory.</w:t>
       </w:r>
     </w:p>
-    <w:bookmarkEnd w:id="61"/>
-    <w:bookmarkStart w:id="62" w:name="confirmatory-studies"/>
+    <w:p>
+      <w:pPr>
+        <w:pStyle w:val="BodyText"/>
+      </w:pPr>
+      <w:r>
+        <w:t xml:space="preserve">Because the delay model is assumed, it was also fitted to real traffic. New York</w:t>
+      </w:r>
+      <w:r>
+        <w:t xml:space="preserve"> </w:t>
+      </w:r>
+      <w:r>
+        <w:t xml:space="preserve">City publishes every yellow-taxi trip</w:t>
+      </w:r>
+      <w:r>
+        <w:t xml:space="preserve"> </w:t>
+      </w:r>
+      <w:r>
+        <w:t xml:space="preserve">((New York City Taxi and Limousine Commission.</w:t>
+      </w:r>
+      <w:r>
+        <w:t xml:space="preserve"> </w:t>
+      </w:r>
+      <w:r>
+        <w:t xml:space="preserve">TLC</w:t>
+      </w:r>
+      <w:r>
+        <w:t xml:space="preserve"> </w:t>
+      </w:r>
+      <w:r>
+        <w:t xml:space="preserve">trip record data: Yellow taxi trip records,</w:t>
+      </w:r>
+      <w:r>
+        <w:t xml:space="preserve"> </w:t>
+      </w:r>
+      <w:r>
+        <w:t xml:space="preserve">January</w:t>
+      </w:r>
+      <w:r>
+        <w:t xml:space="preserve">–</w:t>
+      </w:r>
+      <w:r>
+        <w:t xml:space="preserve">March</w:t>
+      </w:r>
+      <w:r>
+        <w:t xml:space="preserve"> </w:t>
+      </w:r>
+      <w:r>
+        <w:t xml:space="preserve">2024. 2024,</w:t>
+      </w:r>
+      <w:r>
+        <w:t xml:space="preserve"> </w:t>
+      </w:r>
+      <w:hyperlink r:id="rId61">
+        <w:r>
+          <w:rPr>
+            <w:rStyle w:val="Hyperlink"/>
+          </w:rPr>
+          <w:t xml:space="preserve">https://www.nyc.gov/site/tlc/about/tlc-trip-record-data.page</w:t>
+        </w:r>
+      </w:hyperlink>
+      <w:r>
+        <w:t xml:space="preserve">))</w:t>
+      </w:r>
+      <w:r>
+        <w:t xml:space="preserve">; of the 9.6 million</w:t>
+      </w:r>
+      <w:r>
+        <w:t xml:space="preserve"> </w:t>
+      </w:r>
+      <w:r>
+        <w:t xml:space="preserve">trips from January to March 2024, 6.2 million weekday trips between two</w:t>
+      </w:r>
+      <w:r>
+        <w:t xml:space="preserve"> </w:t>
+      </w:r>
+      <w:r>
+        <w:t xml:space="preserve">different taxi zones passed basic checks (0.5 to 30 miles, 1 to 120 minutes and 1</w:t>
+      </w:r>
+      <w:r>
+        <w:t xml:space="preserve"> </w:t>
+      </w:r>
+      <w:r>
+        <w:t xml:space="preserve">to 60 miles per hour). Each trip’s time per mile was used, so that longer and</w:t>
+      </w:r>
+      <w:r>
+        <w:t xml:space="preserve"> </w:t>
+      </w:r>
+      <w:r>
+        <w:t xml:space="preserve">shorter trips between the same two zones can be compared. The time-of-day</w:t>
+      </w:r>
+      <w:r>
+        <w:t xml:space="preserve"> </w:t>
+      </w:r>
+      <w:r>
+        <w:t xml:space="preserve">multipliers compare the same pairs of zones in each period with 09:00–17:00. The</w:t>
+      </w:r>
+      <w:r>
+        <w:t xml:space="preserve"> </w:t>
+      </w:r>
+      <w:r>
+        <w:t xml:space="preserve">spread</w:t>
+      </w:r>
+      <w:r>
+        <w:t xml:space="preserve"> </w:t>
+      </w:r>
+      <m:oMath>
+        <m:r>
+          <m:t>σ</m:t>
+        </m:r>
+      </m:oMath>
+      <w:r>
+        <w:t xml:space="preserve"> </w:t>
+      </w:r>
+      <w:r>
+        <w:t xml:space="preserve">was estimated in two ways: from all variation between trips on the</w:t>
+      </w:r>
+      <w:r>
+        <w:t xml:space="preserve"> </w:t>
+      </w:r>
+      <w:r>
+        <w:t xml:space="preserve">same pair of zones in the same period, which also contains differences between</w:t>
+      </w:r>
+      <w:r>
+        <w:t xml:space="preserve"> </w:t>
+      </w:r>
+      <w:r>
+        <w:t xml:space="preserve">addresses inside a zone and so overstates the variation of one fixed trip, and from</w:t>
+      </w:r>
+      <w:r>
+        <w:t xml:space="preserve"> </w:t>
+      </w:r>
+      <w:r>
+        <w:t xml:space="preserve">the variation between days only, which understates it. The day-common share</w:t>
+      </w:r>
+      <w:r>
+        <w:t xml:space="preserve"> </w:t>
+      </w:r>
+      <m:oMath>
+        <m:r>
+          <m:t>ρ</m:t>
+        </m:r>
+      </m:oMath>
+      <w:r>
+        <w:t xml:space="preserve"> </w:t>
+      </w:r>
+      <w:r>
+        <w:t xml:space="preserve">is the variance of the daily mean divided by each of these. The Amazon check was</w:t>
+      </w:r>
+      <w:r>
+        <w:t xml:space="preserve"> </w:t>
+      </w:r>
+      <w:r>
+        <w:t xml:space="preserve">repeated under both fitted models; the screen and the validation then simulate the</w:t>
+      </w:r>
+      <w:r>
+        <w:t xml:space="preserve"> </w:t>
+      </w:r>
+      <w:r>
+        <w:t xml:space="preserve">fitted model, and nothing else changes.</w:t>
+      </w:r>
+    </w:p>
+    <w:bookmarkEnd w:id="62"/>
+    <w:bookmarkStart w:id="63" w:name="confirmatory-studies"/>
     <w:p>
       <w:pPr>
         <w:pStyle w:val="Heading2"/>
@@ -7265,9 +7426,9 @@
         <w:t xml:space="preserve">of a false confirmation stays below 5% for each pair.</w:t>
       </w:r>
     </w:p>
-    <w:bookmarkEnd w:id="62"/>
     <w:bookmarkEnd w:id="63"/>
-    <w:bookmarkStart w:id="83" w:name="results"/>
+    <w:bookmarkEnd w:id="64"/>
+    <w:bookmarkStart w:id="85" w:name="results"/>
     <w:p>
       <w:pPr>
         <w:pStyle w:val="Heading1"/>
@@ -7276,7 +7437,7 @@
         <w:t xml:space="preserve">Results</w:t>
       </w:r>
     </w:p>
-    <w:bookmarkStart w:id="68" w:name="screening-beats-20-padding"/>
+    <w:bookmarkStart w:id="69" w:name="screening-beats-20-padding"/>
     <w:p>
       <w:pPr>
         <w:pStyle w:val="Heading2"/>
@@ -7456,7 +7617,7 @@
         <w:t xml:space="preserve">).</w:t>
       </w:r>
     </w:p>
-    <w:bookmarkStart w:id="64" w:name="tab:paired"/>
+    <w:bookmarkStart w:id="65" w:name="tab:paired"/>
     <w:p>
       <w:pPr>
         <w:pStyle w:val="TableCaption"/>
@@ -7878,7 +8039,7 @@
         </w:tc>
       </w:tr>
     </w:tbl>
-    <w:bookmarkEnd w:id="64"/>
+    <w:bookmarkEnd w:id="65"/>
     <w:p>
       <w:pPr>
         <w:pStyle w:val="CaptionedFigure"/>
@@ -7888,18 +8049,18 @@
           <wp:inline>
             <wp:extent cx="4533900" cy="2566541"/>
             <wp:effectExtent b="0" l="0" r="0" t="0"/>
-            <wp:docPr descr="" title="" id="66" name="Picture"/>
+            <wp:docPr descr="" title="" id="67" name="Picture"/>
             <a:graphic>
               <a:graphicData uri="http://schemas.openxmlformats.org/drawingml/2006/picture">
                 <pic:pic>
                   <pic:nvPicPr>
-                    <pic:cNvPr descr="Fig1.png" id="67" name="Picture"/>
+                    <pic:cNvPr descr="Fig1.png" id="68" name="Picture"/>
                     <pic:cNvPicPr>
                       <a:picLocks noChangeArrowheads="1" noChangeAspect="1"/>
                     </pic:cNvPicPr>
                   </pic:nvPicPr>
                   <pic:blipFill>
-                    <a:blip r:embed="rId65"/>
+                    <a:blip r:embed="rId66"/>
                     <a:stretch>
                       <a:fillRect/>
                     </a:stretch>
@@ -7980,8 +8141,8 @@
         <w:t xml:space="preserve">bars are 95% bootstrap intervals over instances.</w:t>
       </w:r>
     </w:p>
-    <w:bookmarkEnd w:id="68"/>
-    <w:bookmarkStart w:id="73" w:name="padding-at-other-levels"/>
+    <w:bookmarkEnd w:id="69"/>
+    <w:bookmarkStart w:id="74" w:name="padding-at-other-levels"/>
     <w:p>
       <w:pPr>
         <w:pStyle w:val="Heading2"/>
@@ -8169,7 +8330,7 @@
         <w:t xml:space="preserve">had a plan, so its extra reliability costs only a few percent of distance.</w:t>
       </w:r>
     </w:p>
-    <w:bookmarkStart w:id="69" w:name="tab:padding"/>
+    <w:bookmarkStart w:id="70" w:name="tab:padding"/>
     <w:p>
       <w:pPr>
         <w:pStyle w:val="TableCaption"/>
@@ -9176,7 +9337,7 @@
         </w:tc>
       </w:tr>
     </w:tbl>
-    <w:bookmarkEnd w:id="69"/>
+    <w:bookmarkEnd w:id="70"/>
     <w:p>
       <w:pPr>
         <w:pStyle w:val="CaptionedFigure"/>
@@ -9186,18 +9347,18 @@
           <wp:inline>
             <wp:extent cx="4533900" cy="2692003"/>
             <wp:effectExtent b="0" l="0" r="0" t="0"/>
-            <wp:docPr descr="" title="" id="71" name="Picture"/>
+            <wp:docPr descr="" title="" id="72" name="Picture"/>
             <a:graphic>
               <a:graphicData uri="http://schemas.openxmlformats.org/drawingml/2006/picture">
                 <pic:pic>
                   <pic:nvPicPr>
-                    <pic:cNvPr descr="FigPadding.png" id="72" name="Picture"/>
+                    <pic:cNvPr descr="FigPadding.png" id="73" name="Picture"/>
                     <pic:cNvPicPr>
                       <a:picLocks noChangeArrowheads="1" noChangeAspect="1"/>
                     </pic:cNvPicPr>
                   </pic:nvPicPr>
                   <pic:blipFill>
-                    <a:blip r:embed="rId70"/>
+                    <a:blip r:embed="rId71"/>
                     <a:stretch>
                       <a:fillRect/>
                     </a:stretch>
@@ -9256,8 +9417,8 @@
         <w:t xml:space="preserve">procedure over all instances with its 95% bootstrap interval.</w:t>
       </w:r>
     </w:p>
-    <w:bookmarkEnd w:id="73"/>
-    <w:bookmarkStart w:id="75" w:name="the-cap-removes-most-failures"/>
+    <w:bookmarkEnd w:id="74"/>
+    <w:bookmarkStart w:id="76" w:name="the-cap-removes-most-failures"/>
     <w:p>
       <w:pPr>
         <w:pStyle w:val="Heading2"/>
@@ -9345,7 +9506,7 @@
         <w:t xml:space="preserve">days, which shows that the screen rarely admits a plan that later disappoints.</w:t>
       </w:r>
     </w:p>
-    <w:bookmarkStart w:id="74" w:name="tab:screen"/>
+    <w:bookmarkStart w:id="75" w:name="tab:screen"/>
     <w:p>
       <w:pPr>
         <w:pStyle w:val="TableCaption"/>
@@ -9856,7 +10017,7 @@
         </w:tc>
       </w:tr>
     </w:tbl>
-    <w:bookmarkEnd w:id="74"/>
+    <w:bookmarkEnd w:id="75"/>
     <w:p>
       <w:pPr>
         <w:pStyle w:val="BodyText"/>
@@ -9883,8 +10044,8 @@
         <w:t xml:space="preserve">11 fallback plans averaged 45.2%.</w:t>
       </w:r>
     </w:p>
-    <w:bookmarkEnd w:id="75"/>
-    <w:bookmarkStart w:id="77" w:name="standard-benchmark-instances"/>
+    <w:bookmarkEnd w:id="76"/>
+    <w:bookmarkStart w:id="78" w:name="standard-benchmark-instances"/>
     <w:p>
       <w:pPr>
         <w:pStyle w:val="Heading2"/>
@@ -9954,7 +10115,7 @@
         <w:t xml:space="preserve">benchmark instances is close to the one on the synthetic instances.</w:t>
       </w:r>
     </w:p>
-    <w:bookmarkStart w:id="76" w:name="tab:gh"/>
+    <w:bookmarkStart w:id="77" w:name="tab:gh"/>
     <w:p>
       <w:pPr>
         <w:pStyle w:val="TableCaption"/>
@@ -10242,9 +10403,9 @@
         </w:tc>
       </w:tr>
     </w:tbl>
-    <w:bookmarkEnd w:id="76"/>
     <w:bookmarkEnd w:id="77"/>
-    <w:bookmarkStart w:id="79" w:name="real-delivery-routes"/>
+    <w:bookmarkEnd w:id="78"/>
+    <w:bookmarkStart w:id="81" w:name="real-delivery-routes"/>
     <w:p>
       <w:pPr>
         <w:pStyle w:val="Heading2"/>
@@ -10258,66 +10419,66 @@
         <w:pStyle w:val="FirstParagraph"/>
       </w:pPr>
       <w:r>
-        <w:t xml:space="preserve">On the Amazon routes, both screened procedures were more reliable than 20%</w:t>
-      </w:r>
-      <w:r>
-        <w:t xml:space="preserve"> </w:t>
-      </w:r>
-      <w:r>
-        <w:t xml:space="preserve">padding (Table </w:t>
+        <w:t xml:space="preserve">Under the assumed delay model, both screened procedures were more reliable than</w:t>
+      </w:r>
+      <w:r>
+        <w:t xml:space="preserve"> </w:t>
+      </w:r>
+      <w:r>
+        <w:t xml:space="preserve">20% padding (Table </w:t>
       </w:r>
       <w:hyperlink w:anchor="tab:amazon">
         <w:r>
           <w:rPr>
             <w:rStyle w:val="Hyperlink"/>
           </w:rPr>
-          <w:t xml:space="preserve">5</w:t>
+          <w:t xml:space="preserve">6</w:t>
         </w:r>
       </w:hyperlink>
       <w:r>
-        <w:t xml:space="preserve">). Screened conservative pooled 75.3% against</w:t>
-      </w:r>
-      <w:r>
-        <w:t xml:space="preserve"> </w:t>
-      </w:r>
-      <w:r>
-        <w:t xml:space="preserve">59.0% for padding, a difference of 16.3 [11.0, 22.2]</w:t>
-      </w:r>
-      <w:r>
-        <w:t xml:space="preserve"> </w:t>
-      </w:r>
-      <w:r>
-        <w:t xml:space="preserve">points, and the capped procedure pooled 72.6%, 13.6 [3.9,</w:t>
-      </w:r>
-      <w:r>
-        <w:t xml:space="preserve"> </w:t>
-      </w:r>
-      <w:r>
-        <w:t xml:space="preserve">24.4] points above padding. Part of the gap comes from planning: padding</w:t>
-      </w:r>
-      <w:r>
-        <w:t xml:space="preserve"> </w:t>
-      </w:r>
-      <w:r>
-        <w:t xml:space="preserve">found no plan on 12 routes, against</w:t>
-      </w:r>
-      <w:r>
-        <w:t xml:space="preserve"> </w:t>
-      </w:r>
-      <w:r>
-        <w:t xml:space="preserve">6 for the other configurations. Where the capped procedure admitted a</w:t>
-      </w:r>
-      <w:r>
-        <w:t xml:space="preserve"> </w:t>
-      </w:r>
-      <w:r>
-        <w:t xml:space="preserve">plan (24 routes), its validated service averaged 97.4%,</w:t>
-      </w:r>
-      <w:r>
-        <w:t xml:space="preserve"> </w:t>
-      </w:r>
-      <w:r>
-        <w:t xml:space="preserve">and on 23 of them it was at least 95%. On the</w:t>
+        <w:t xml:space="preserve">). The capped procedure pooled 72.6%</w:t>
+      </w:r>
+      <w:r>
+        <w:t xml:space="preserve"> </w:t>
+      </w:r>
+      <w:r>
+        <w:t xml:space="preserve">against 59.0% for padding, a difference of 13.6 [3.9,</w:t>
+      </w:r>
+      <w:r>
+        <w:t xml:space="preserve"> </w:t>
+      </w:r>
+      <w:r>
+        <w:t xml:space="preserve">24.4] points, and screened conservative pooled 75.3%, 16.3</w:t>
+      </w:r>
+      <w:r>
+        <w:t xml:space="preserve"> </w:t>
+      </w:r>
+      <w:r>
+        <w:t xml:space="preserve">[11.0, 22.2] points above padding. Part of the gap comes from</w:t>
+      </w:r>
+      <w:r>
+        <w:t xml:space="preserve"> </w:t>
+      </w:r>
+      <w:r>
+        <w:t xml:space="preserve">planning: padding found no plan on 12 routes, against 6 for</w:t>
+      </w:r>
+      <w:r>
+        <w:t xml:space="preserve"> </w:t>
+      </w:r>
+      <w:r>
+        <w:t xml:space="preserve">the other configurations. Where the capped procedure admitted a plan</w:t>
+      </w:r>
+      <w:r>
+        <w:t xml:space="preserve"> </w:t>
+      </w:r>
+      <w:r>
+        <w:t xml:space="preserve">(24 routes), its validated service averaged 97.4%, and</w:t>
+      </w:r>
+      <w:r>
+        <w:t xml:space="preserve"> </w:t>
+      </w:r>
+      <w:r>
+        <w:t xml:space="preserve">23 of these plans reached at least 95%. On the</w:t>
       </w:r>
       <w:r>
         <w:t xml:space="preserve"> </w:t>
@@ -10358,60 +10519,224 @@
         <w:t xml:space="preserve"> </w:t>
       </w:r>
       <w:r>
-        <w:t xml:space="preserve">avoids that weakness because its fallback is the padded plan. On 6 routes</w:t>
-      </w:r>
-      <w:r>
-        <w:t xml:space="preserve"> </w:t>
-      </w:r>
-      <w:r>
-        <w:t xml:space="preserve">with 22 to 36 customers no configuration found a plan within the time limit, even</w:t>
-      </w:r>
-      <w:r>
-        <w:t xml:space="preserve"> </w:t>
-      </w:r>
-      <w:r>
-        <w:t xml:space="preserve">though the driver’s own order is feasible by construction, so these failures are</w:t>
-      </w:r>
-      <w:r>
-        <w:t xml:space="preserve"> </w:t>
-      </w:r>
-      <w:r>
-        <w:t xml:space="preserve">limits of the solver’s search, not of the instances.</w:t>
+        <w:t xml:space="preserve">avoids that weakness because its fallback is the padded plan.</w:t>
       </w:r>
     </w:p>
-    <w:bookmarkStart w:id="78" w:name="tab:amazon"/>
+    <w:p>
+      <w:pPr>
+        <w:pStyle w:val="BodyText"/>
+      </w:pPr>
+      <w:r>
+        <w:t xml:space="preserve">The fitted delay model differs from the assumed one in one important way: in New</w:t>
+      </w:r>
+      <w:r>
+        <w:t xml:space="preserve"> </w:t>
+      </w:r>
+      <w:r>
+        <w:t xml:space="preserve">York the rush hours were not slower than the middle of the day. Trips between</w:t>
+      </w:r>
+      <w:r>
+        <w:t xml:space="preserve"> </w:t>
+      </w:r>
+      <w:r>
+        <w:t xml:space="preserve">07:00 and 09:00 were 16% faster, and trips between 17:00 and 19:00</w:t>
+      </w:r>
+      <w:r>
+        <w:t xml:space="preserve"> </w:t>
+      </w:r>
+      <w:r>
+        <w:t xml:space="preserve">6% faster, than trips between 09:00 and 17:00 (Table </w:t>
+      </w:r>
+      <w:hyperlink w:anchor="tab:nyc">
+        <w:r>
+          <w:rPr>
+            <w:rStyle w:val="Hyperlink"/>
+          </w:rPr>
+          <w:t xml:space="preserve">5</w:t>
+        </w:r>
+      </w:hyperlink>
+      <w:r>
+        <w:t xml:space="preserve">). The</w:t>
+      </w:r>
+      <w:r>
+        <w:t xml:space="preserve"> </w:t>
+      </w:r>
+      <w:r>
+        <w:t xml:space="preserve">assumed spread of 0.20 lies between the two fitted values. Under both fitted models</w:t>
+      </w:r>
+      <w:r>
+        <w:t xml:space="preserve"> </w:t>
+      </w:r>
+      <w:r>
+        <w:t xml:space="preserve">the capped procedure stayed more reliable than padding over all routes, by</w:t>
+      </w:r>
+      <w:r>
+        <w:t xml:space="preserve"> </w:t>
+      </w:r>
+      <w:r>
+        <w:t xml:space="preserve">13.9 [3.8, 26.2] points with day-to-day variation</w:t>
+      </w:r>
+      <w:r>
+        <w:t xml:space="preserve"> </w:t>
+      </w:r>
+      <w:r>
+        <w:t xml:space="preserve">and by 20.6 [10.9, 31.4] points with all variation.</w:t>
+      </w:r>
+      <w:r>
+        <w:t xml:space="preserve"> </w:t>
+      </w:r>
+      <w:r>
+        <w:t xml:space="preserve">With day-to-day variation the delays are small: the screen admitted a plan on</w:t>
+      </w:r>
+      <w:r>
+        <w:t xml:space="preserve"> </w:t>
+      </w:r>
+      <w:r>
+        <w:t xml:space="preserve">34 of the 34 routes with a plan and</w:t>
+      </w:r>
+      <w:r>
+        <w:t xml:space="preserve"> </w:t>
+      </w:r>
+      <w:r>
+        <w:t xml:space="preserve">33 of them reached 95%, but on the 28 routes</w:t>
+      </w:r>
+      <w:r>
+        <w:t xml:space="preserve"> </w:t>
+      </w:r>
+      <w:r>
+        <w:t xml:space="preserve">where padding also had a plan, padding was slightly more reliable (screening minus</w:t>
+      </w:r>
+      <w:r>
+        <w:t xml:space="preserve"> </w:t>
+      </w:r>
+      <w:r>
+        <w:t xml:space="preserve">padding</w:t>
+      </w:r>
+      <w:r>
+        <w:t xml:space="preserve"> </w:t>
+      </w:r>
+      <m:oMath>
+        <m:r>
+          <m:rPr>
+            <m:sty m:val="p"/>
+          </m:rPr>
+          <m:t>−</m:t>
+        </m:r>
+      </m:oMath>
+      <w:r>
+        <w:t xml:space="preserve">1.2 [</w:t>
+      </w:r>
+      <m:oMath>
+        <m:r>
+          <m:rPr>
+            <m:sty m:val="p"/>
+          </m:rPr>
+          <m:t>−</m:t>
+        </m:r>
+      </m:oMath>
+      <w:r>
+        <w:t xml:space="preserve">1.9,</w:t>
+      </w:r>
+      <w:r>
+        <w:t xml:space="preserve"> </w:t>
+      </w:r>
+      <m:oMath>
+        <m:r>
+          <m:rPr>
+            <m:sty m:val="p"/>
+          </m:rPr>
+          <m:t>−</m:t>
+        </m:r>
+      </m:oMath>
+      <w:r>
+        <w:t xml:space="preserve">0.6] points). Under that</w:t>
+      </w:r>
+      <w:r>
+        <w:t xml:space="preserve"> </w:t>
+      </w:r>
+      <w:r>
+        <w:t xml:space="preserve">model the advantage of screening comes from planning routes that padding could</w:t>
+      </w:r>
+      <w:r>
+        <w:t xml:space="preserve"> </w:t>
+      </w:r>
+      <w:r>
+        <w:t xml:space="preserve">not. With all variation the delays are larger, and screening was also more</w:t>
+      </w:r>
+      <w:r>
+        <w:t xml:space="preserve"> </w:t>
+      </w:r>
+      <w:r>
+        <w:t xml:space="preserve">reliable on the routes where both had a plan (8.8 [4.6,</w:t>
+      </w:r>
+      <w:r>
+        <w:t xml:space="preserve"> </w:t>
+      </w:r>
+      <w:r>
+        <w:t xml:space="preserve">13.3] points).</w:t>
+      </w:r>
+    </w:p>
+    <w:p>
+      <w:pPr>
+        <w:pStyle w:val="BodyText"/>
+      </w:pPr>
+      <w:r>
+        <w:t xml:space="preserve">On 6 routes with 22 to 36 customers no</w:t>
+      </w:r>
+      <w:r>
+        <w:t xml:space="preserve"> </w:t>
+      </w:r>
+      <w:r>
+        <w:t xml:space="preserve">configuration found a plan within the time limit, even though the driver’s own</w:t>
+      </w:r>
+      <w:r>
+        <w:t xml:space="preserve"> </w:t>
+      </w:r>
+      <w:r>
+        <w:t xml:space="preserve">order is feasible by construction, so these failures are limits of the solver’s</w:t>
+      </w:r>
+      <w:r>
+        <w:t xml:space="preserve"> </w:t>
+      </w:r>
+      <w:r>
+        <w:t xml:space="preserve">search, not of the instances.</w:t>
+      </w:r>
+    </w:p>
+    <w:bookmarkStart w:id="79" w:name="tab:nyc"/>
     <w:p>
       <w:pPr>
         <w:pStyle w:val="TableCaption"/>
       </w:pPr>
       <w:r>
-        <w:t xml:space="preserve">Real delivery routes: 40 Amazon routes from five US cities (exploratory).</w:t>
-      </w:r>
-      <w:r>
-        <w:t xml:space="preserve"> </w:t>
-      </w:r>
-      <w:r>
-        <w:rPr>
-          <w:iCs/>
-          <w:i/>
-        </w:rPr>
-        <w:t xml:space="preserve">Plans</w:t>
-      </w:r>
-      <w:r>
-        <w:t xml:space="preserve">: routes on which the configuration produced a plan;</w:t>
-      </w:r>
-      <w:r>
-        <w:t xml:space="preserve"> </w:t>
-      </w:r>
-      <w:r>
-        <w:rPr>
-          <w:iCs/>
-          <w:i/>
-        </w:rPr>
-        <w:t xml:space="preserve">Admitted</w:t>
-      </w:r>
-      <w:r>
-        <w:t xml:space="preserve">: routes on which a candidate passed the screen. Pooled validated service probability (%) with a 95% bootstrap interval over routes; a route without a plan scores zero.</w:t>
+        <w:t xml:space="preserve">The delay model fitted to 6.2 million weekday New York yellow-taxi trips (January–March 2024). Time-of-day multipliers of travel time relative to 09:00–17:00, from zone pairs with at least 20 trips in both periods; the spread</w:t>
+      </w:r>
+      <w:r>
+        <w:t xml:space="preserve"> </w:t>
+      </w:r>
+      <m:oMath>
+        <m:r>
+          <m:t>σ</m:t>
+        </m:r>
+      </m:oMath>
+      <w:r>
+        <w:t xml:space="preserve"> </w:t>
+      </w:r>
+      <w:r>
+        <w:t xml:space="preserve">and the day-common share</w:t>
+      </w:r>
+      <w:r>
+        <w:t xml:space="preserve"> </w:t>
+      </w:r>
+      <m:oMath>
+        <m:r>
+          <m:t>ρ</m:t>
+        </m:r>
+      </m:oMath>
+      <w:r>
+        <w:t xml:space="preserve"> </w:t>
+      </w:r>
+      <w:r>
+        <w:t xml:space="preserve">of the random factor are estimated in two ways (see text).</w:t>
       </w:r>
     </w:p>
     <w:tbl>
@@ -10420,7 +10745,7 @@
         <w:tblW w:type="auto" w:w="0"/>
         <w:tblLook w:firstRow="1" w:lastRow="0" w:firstColumn="0" w:lastColumn="0" w:noHBand="0" w:noVBand="0" w:val="0020"/>
         <w:jc w:val="start"/>
-        <w:tblCaption w:val="Real delivery routes: 40 Amazon routes from five US cities (exploratory). Plans: routes on which the configuration produced a plan; Admitted: routes on which a candidate passed the screen. Pooled validated service probability (%) with a 95% bootstrap interval over routes; a route without a plan scores zero."/>
+        <w:tblCaption w:val="The delay model fitted to 6.2 million weekday New York yellow-taxi trips (January–March 2024). Time-of-day multipliers of travel time relative to 09:00–17:00, from zone pairs with at least 20 trips in both periods; the spread \sigma and the day-common share \rho of the random factor are estimated in two ways (see text)."/>
       </w:tblPr>
       <w:tblGrid>
         <w:gridCol w:w="1980"/>
@@ -10440,7 +10765,7 @@
               <w:jc w:val="left"/>
             </w:pPr>
             <w:r>
-              <w:t xml:space="preserve">Configuration</w:t>
+              <w:t xml:space="preserve">Period</w:t>
             </w:r>
           </w:p>
         </w:tc>
@@ -10452,7 +10777,7 @@
               <w:jc w:val="center"/>
             </w:pPr>
             <w:r>
-              <w:t xml:space="preserve">Plans</w:t>
+              <w:t xml:space="preserve">Assumed</w:t>
             </w:r>
           </w:p>
         </w:tc>
@@ -10464,19 +10789,19 @@
               <w:jc w:val="center"/>
             </w:pPr>
             <w:r>
-              <w:t xml:space="preserve">Admitted</w:t>
-            </w:r>
-          </w:p>
-        </w:tc>
-        <w:tc>
-          <w:tcPr/>
-          <w:p>
-            <w:pPr>
-              <w:pStyle w:val="Compact"/>
-              <w:jc w:val="left"/>
-            </w:pPr>
-            <w:r>
-              <w:t xml:space="preserve">Pooled service</w:t>
+              <w:t xml:space="preserve">Fitted</w:t>
+            </w:r>
+          </w:p>
+        </w:tc>
+        <w:tc>
+          <w:tcPr/>
+          <w:p>
+            <w:pPr>
+              <w:pStyle w:val="Compact"/>
+              <w:jc w:val="right"/>
+            </w:pPr>
+            <w:r>
+              <w:t xml:space="preserve">Zone pairs</w:t>
             </w:r>
           </w:p>
         </w:tc>
@@ -10490,7 +10815,7 @@
               <w:jc w:val="left"/>
             </w:pPr>
             <w:r>
-              <w:t xml:space="preserve">Nominal plan (no protection)</w:t>
+              <w:t xml:space="preserve">00:00–07:00</w:t>
             </w:r>
           </w:p>
         </w:tc>
@@ -10502,7 +10827,7 @@
               <w:jc w:val="center"/>
             </w:pPr>
             <w:r>
-              <w:t xml:space="preserve">34/40</w:t>
+              <w:t xml:space="preserve">0.9</w:t>
             </w:r>
           </w:p>
         </w:tc>
@@ -10514,19 +10839,25 @@
               <w:jc w:val="center"/>
             </w:pPr>
             <w:r>
-              <w:t xml:space="preserve">–</w:t>
-            </w:r>
-          </w:p>
-        </w:tc>
-        <w:tc>
-          <w:tcPr/>
-          <w:p>
-            <w:pPr>
-              <w:pStyle w:val="Compact"/>
-              <w:jc w:val="left"/>
-            </w:pPr>
-            <w:r>
-              <w:t xml:space="preserve">41.4 [35.1, 47.1]</w:t>
+              <w:t xml:space="preserve">0.62</w:t>
+            </w:r>
+          </w:p>
+        </w:tc>
+        <w:tc>
+          <w:tcPr/>
+          <w:p>
+            <w:pPr>
+              <w:pStyle w:val="Compact"/>
+              <w:jc w:val="right"/>
+            </w:pPr>
+            <w:r>
+              <w:t xml:space="preserve">2</w:t>
+            </w:r>
+            <w:r>
+              <w:t xml:space="preserve">,</w:t>
+            </w:r>
+            <w:r>
+              <w:t xml:space="preserve">669</w:t>
             </w:r>
           </w:p>
         </w:tc>
@@ -10540,7 +10871,7 @@
               <w:jc w:val="left"/>
             </w:pPr>
             <w:r>
-              <w:t xml:space="preserve">20% padding</w:t>
+              <w:t xml:space="preserve">07:00–09:00</w:t>
             </w:r>
           </w:p>
         </w:tc>
@@ -10552,7 +10883,7 @@
               <w:jc w:val="center"/>
             </w:pPr>
             <w:r>
-              <w:t xml:space="preserve">28/40</w:t>
+              <w:t xml:space="preserve">1.2</w:t>
             </w:r>
           </w:p>
         </w:tc>
@@ -10564,19 +10895,25 @@
               <w:jc w:val="center"/>
             </w:pPr>
             <w:r>
-              <w:t xml:space="preserve">–</w:t>
-            </w:r>
-          </w:p>
-        </w:tc>
-        <w:tc>
-          <w:tcPr/>
-          <w:p>
-            <w:pPr>
-              <w:pStyle w:val="Compact"/>
-              <w:jc w:val="left"/>
-            </w:pPr>
-            <w:r>
-              <w:t xml:space="preserve">59.0 [46.6, 70.8]</w:t>
+              <w:t xml:space="preserve">0.84</w:t>
+            </w:r>
+          </w:p>
+        </w:tc>
+        <w:tc>
+          <w:tcPr/>
+          <w:p>
+            <w:pPr>
+              <w:pStyle w:val="Compact"/>
+              <w:jc w:val="right"/>
+            </w:pPr>
+            <w:r>
+              <w:t xml:space="preserve">2</w:t>
+            </w:r>
+            <w:r>
+              <w:t xml:space="preserve">,</w:t>
+            </w:r>
+            <w:r>
+              <w:t xml:space="preserve">424</w:t>
             </w:r>
           </w:p>
         </w:tc>
@@ -10590,7 +10927,7 @@
               <w:jc w:val="left"/>
             </w:pPr>
             <w:r>
-              <w:t xml:space="preserve">Capped screening procedure</w:t>
+              <w:t xml:space="preserve">09:00–17:00</w:t>
             </w:r>
           </w:p>
         </w:tc>
@@ -10602,7 +10939,7 @@
               <w:jc w:val="center"/>
             </w:pPr>
             <w:r>
-              <w:t xml:space="preserve">34/40</w:t>
+              <w:t xml:space="preserve">1.0</w:t>
             </w:r>
           </w:p>
         </w:tc>
@@ -10614,19 +10951,25 @@
               <w:jc w:val="center"/>
             </w:pPr>
             <w:r>
-              <w:t xml:space="preserve">24</w:t>
-            </w:r>
-          </w:p>
-        </w:tc>
-        <w:tc>
-          <w:tcPr/>
-          <w:p>
-            <w:pPr>
-              <w:pStyle w:val="Compact"/>
-              <w:jc w:val="left"/>
-            </w:pPr>
-            <w:r>
-              <w:t xml:space="preserve">72.6 [61.2, 82.9]</w:t>
+              <w:t xml:space="preserve">1.00</w:t>
+            </w:r>
+          </w:p>
+        </w:tc>
+        <w:tc>
+          <w:tcPr/>
+          <w:p>
+            <w:pPr>
+              <w:pStyle w:val="Compact"/>
+              <w:jc w:val="right"/>
+            </w:pPr>
+            <w:r>
+              <w:t xml:space="preserve">4</w:t>
+            </w:r>
+            <w:r>
+              <w:t xml:space="preserve">,</w:t>
+            </w:r>
+            <w:r>
+              <w:t xml:space="preserve">603</w:t>
             </w:r>
           </w:p>
         </w:tc>
@@ -10640,7 +10983,7 @@
               <w:jc w:val="left"/>
             </w:pPr>
             <w:r>
-              <w:t xml:space="preserve">Screened conservative</w:t>
+              <w:t xml:space="preserve">17:00–19:00</w:t>
             </w:r>
           </w:p>
         </w:tc>
@@ -10652,7 +10995,7 @@
               <w:jc w:val="center"/>
             </w:pPr>
             <w:r>
-              <w:t xml:space="preserve">34/40</w:t>
+              <w:t xml:space="preserve">1.3</w:t>
             </w:r>
           </w:p>
         </w:tc>
@@ -10664,10 +11007,30 @@
               <w:jc w:val="center"/>
             </w:pPr>
             <w:r>
-              <w:t xml:space="preserve">25</w:t>
-            </w:r>
-          </w:p>
-        </w:tc>
+              <w:t xml:space="preserve">0.94</w:t>
+            </w:r>
+          </w:p>
+        </w:tc>
+        <w:tc>
+          <w:tcPr/>
+          <w:p>
+            <w:pPr>
+              <w:pStyle w:val="Compact"/>
+              <w:jc w:val="right"/>
+            </w:pPr>
+            <w:r>
+              <w:t xml:space="preserve">3</w:t>
+            </w:r>
+            <w:r>
+              <w:t xml:space="preserve">,</w:t>
+            </w:r>
+            <w:r>
+              <w:t xml:space="preserve">237</w:t>
+            </w:r>
+          </w:p>
+        </w:tc>
+      </w:tr>
+      <w:tr>
         <w:tc>
           <w:tcPr/>
           <w:p>
@@ -10676,15 +11039,674 @@
               <w:jc w:val="left"/>
             </w:pPr>
             <w:r>
-              <w:t xml:space="preserve">75.3 [63.6, 85.7]</w:t>
-            </w:r>
+              <w:t xml:space="preserve">19:00–24:00</w:t>
+            </w:r>
+          </w:p>
+        </w:tc>
+        <w:tc>
+          <w:tcPr/>
+          <w:p>
+            <w:pPr>
+              <w:pStyle w:val="Compact"/>
+              <w:jc w:val="center"/>
+            </w:pPr>
+            <w:r>
+              <w:t xml:space="preserve">0.9</w:t>
+            </w:r>
+          </w:p>
+        </w:tc>
+        <w:tc>
+          <w:tcPr/>
+          <w:p>
+            <w:pPr>
+              <w:pStyle w:val="Compact"/>
+              <w:jc w:val="center"/>
+            </w:pPr>
+            <w:r>
+              <w:t xml:space="preserve">0.76</w:t>
+            </w:r>
+          </w:p>
+        </w:tc>
+        <w:tc>
+          <w:tcPr/>
+          <w:p>
+            <w:pPr>
+              <w:pStyle w:val="Compact"/>
+              <w:jc w:val="right"/>
+            </w:pPr>
+            <w:r>
+              <w:t xml:space="preserve">3</w:t>
+            </w:r>
+            <w:r>
+              <w:t xml:space="preserve">,</w:t>
+            </w:r>
+            <w:r>
+              <w:t xml:space="preserve">865</w:t>
+            </w:r>
+          </w:p>
+        </w:tc>
+      </w:tr>
+      <w:tr>
+        <w:tc>
+          <w:tcPr/>
+          <w:p>
+            <w:pPr>
+              <w:pStyle w:val="Compact"/>
+              <w:jc w:val="left"/>
+            </w:pPr>
+            <m:oMath>
+              <m:r>
+                <m:t>σ</m:t>
+              </m:r>
+            </m:oMath>
+          </w:p>
+        </w:tc>
+        <w:tc>
+          <w:tcPr/>
+          <w:p>
+            <w:pPr>
+              <w:pStyle w:val="Compact"/>
+              <w:jc w:val="center"/>
+            </w:pPr>
+            <w:r>
+              <w:t xml:space="preserve">0.20</w:t>
+            </w:r>
+          </w:p>
+        </w:tc>
+        <w:tc>
+          <w:tcPr/>
+          <w:p>
+            <w:pPr>
+              <w:pStyle w:val="Compact"/>
+              <w:jc w:val="center"/>
+            </w:pPr>
+            <w:r>
+              <w:t xml:space="preserve">0.11 (day to day), 0.27 (all)</w:t>
+            </w:r>
+          </w:p>
+        </w:tc>
+        <w:tc>
+          <w:tcPr/>
+          <w:p>
+            <w:pPr>
+              <w:pStyle w:val="Compact"/>
+            </w:pPr>
+          </w:p>
+        </w:tc>
+      </w:tr>
+      <w:tr>
+        <w:tc>
+          <w:tcPr/>
+          <w:p>
+            <w:pPr>
+              <w:pStyle w:val="Compact"/>
+              <w:jc w:val="left"/>
+            </w:pPr>
+            <m:oMath>
+              <m:r>
+                <m:t>ρ</m:t>
+              </m:r>
+            </m:oMath>
+          </w:p>
+        </w:tc>
+        <w:tc>
+          <w:tcPr/>
+          <w:p>
+            <w:pPr>
+              <w:pStyle w:val="Compact"/>
+              <w:jc w:val="center"/>
+            </w:pPr>
+            <w:r>
+              <w:t xml:space="preserve">0.50</w:t>
+            </w:r>
+          </w:p>
+        </w:tc>
+        <w:tc>
+          <w:tcPr/>
+          <w:p>
+            <w:pPr>
+              <w:pStyle w:val="Compact"/>
+              <w:jc w:val="center"/>
+            </w:pPr>
+            <w:r>
+              <w:t xml:space="preserve">0.40 (day to day), 0.06 (all)</w:t>
+            </w:r>
+          </w:p>
+        </w:tc>
+        <w:tc>
+          <w:tcPr/>
+          <w:p>
+            <w:pPr>
+              <w:pStyle w:val="Compact"/>
+            </w:pPr>
           </w:p>
         </w:tc>
       </w:tr>
     </w:tbl>
-    <w:bookmarkEnd w:id="78"/>
     <w:bookmarkEnd w:id="79"/>
-    <w:bookmarkStart w:id="81" w:name="confirmatory-studies-1"/>
+    <w:bookmarkStart w:id="80" w:name="tab:amazon"/>
+    <w:p>
+      <w:pPr>
+        <w:pStyle w:val="TableCaption"/>
+      </w:pPr>
+      <w:r>
+        <w:t xml:space="preserve">Real delivery routes: 40 Amazon routes from five US cities (exploratory), under the assumed delay model and under the two delay models fitted to New York taxi trips (Table </w:t>
+      </w:r>
+      <w:hyperlink w:anchor="tab:nyc">
+        <w:r>
+          <w:rPr>
+            <w:rStyle w:val="Hyperlink"/>
+          </w:rPr>
+          <w:t xml:space="preserve">5</w:t>
+        </w:r>
+      </w:hyperlink>
+      <w:r>
+        <w:t xml:space="preserve">).</w:t>
+      </w:r>
+      <w:r>
+        <w:t xml:space="preserve"> </w:t>
+      </w:r>
+      <w:r>
+        <w:rPr>
+          <w:iCs/>
+          <w:i/>
+        </w:rPr>
+        <w:t xml:space="preserve">Plans</w:t>
+      </w:r>
+      <w:r>
+        <w:t xml:space="preserve">: routes on which the configuration produced a plan (the same under every delay model). Pooled validated service probability (%) with a 95% bootstrap interval over routes; a route without a plan scores zero.</w:t>
+      </w:r>
+      <w:r>
+        <w:t xml:space="preserve"> </w:t>
+      </w:r>
+      <w:r>
+        <w:rPr>
+          <w:iCs/>
+          <w:i/>
+        </w:rPr>
+        <w:t xml:space="preserve">Admitted</w:t>
+      </w:r>
+      <w:r>
+        <w:t xml:space="preserve">: routes on which a candidate passed the screen.</w:t>
+      </w:r>
+    </w:p>
+    <w:tbl>
+      <w:tblPr>
+        <w:tblStyle w:val="Table"/>
+        <w:tblW w:type="auto" w:w="0"/>
+        <w:tblLook w:firstRow="0" w:lastRow="0" w:firstColumn="0" w:lastColumn="0" w:noHBand="0" w:noVBand="0" w:val="0000"/>
+        <w:jc w:val="start"/>
+        <w:tblCaption w:val="Real delivery routes: 40 Amazon routes from five US cities (exploratory), under the assumed delay model and under the two delay models fitted to New York taxi trips (Table 5). Plans: routes on which the configuration produced a plan (the same under every delay model). Pooled validated service probability (%) with a 95% bootstrap interval over routes; a route without a plan scores zero. Admitted: routes on which a candidate passed the screen."/>
+      </w:tblPr>
+      <w:tblGrid>
+        <w:gridCol w:w="1584"/>
+        <w:gridCol w:w="1584"/>
+        <w:gridCol w:w="1584"/>
+        <w:gridCol w:w="1584"/>
+        <w:gridCol w:w="1584"/>
+      </w:tblGrid>
+      <w:tr>
+        <w:tc>
+          <w:tcPr/>
+          <w:p>
+            <w:pPr>
+              <w:pStyle w:val="Compact"/>
+            </w:pPr>
+          </w:p>
+        </w:tc>
+        <w:tc>
+          <w:tcPr/>
+          <w:p>
+            <w:pPr>
+              <w:pStyle w:val="Compact"/>
+            </w:pPr>
+          </w:p>
+        </w:tc>
+        <w:tc>
+          <w:tcPr>
+            <w:gridSpan w:val="3"/>
+          </w:tcPr>
+          <w:p>
+            <w:pPr>
+              <w:pStyle w:val="Compact"/>
+              <w:jc w:val="center"/>
+            </w:pPr>
+            <w:r>
+              <w:t xml:space="preserve">Pooled service under the delay model</w:t>
+            </w:r>
+          </w:p>
+        </w:tc>
+      </w:tr>
+      <w:tr>
+        <w:tc>
+          <w:tcPr/>
+          <w:p>
+            <w:pPr>
+              <w:pStyle w:val="Compact"/>
+              <w:jc w:val="left"/>
+            </w:pPr>
+            <w:r>
+              <w:t xml:space="preserve">Configuration</w:t>
+            </w:r>
+          </w:p>
+        </w:tc>
+        <w:tc>
+          <w:tcPr/>
+          <w:p>
+            <w:pPr>
+              <w:pStyle w:val="Compact"/>
+              <w:jc w:val="center"/>
+            </w:pPr>
+            <w:r>
+              <w:t xml:space="preserve">Plans</w:t>
+            </w:r>
+          </w:p>
+        </w:tc>
+        <w:tc>
+          <w:tcPr/>
+          <w:p>
+            <w:pPr>
+              <w:pStyle w:val="Compact"/>
+              <w:jc w:val="left"/>
+            </w:pPr>
+            <w:r>
+              <w:t xml:space="preserve">Assumed</w:t>
+            </w:r>
+          </w:p>
+        </w:tc>
+        <w:tc>
+          <w:tcPr/>
+          <w:p>
+            <w:pPr>
+              <w:pStyle w:val="Compact"/>
+              <w:jc w:val="left"/>
+            </w:pPr>
+            <w:r>
+              <w:t xml:space="preserve">NYC, day to day</w:t>
+            </w:r>
+          </w:p>
+        </w:tc>
+        <w:tc>
+          <w:tcPr/>
+          <w:p>
+            <w:pPr>
+              <w:pStyle w:val="Compact"/>
+              <w:jc w:val="left"/>
+            </w:pPr>
+            <w:r>
+              <w:t xml:space="preserve">NYC, all variation</w:t>
+            </w:r>
+          </w:p>
+        </w:tc>
+      </w:tr>
+      <w:tr>
+        <w:tc>
+          <w:tcPr/>
+          <w:p>
+            <w:pPr>
+              <w:pStyle w:val="Compact"/>
+              <w:jc w:val="left"/>
+            </w:pPr>
+            <w:r>
+              <w:t xml:space="preserve">Nominal plan (no protection)</w:t>
+            </w:r>
+          </w:p>
+        </w:tc>
+        <w:tc>
+          <w:tcPr/>
+          <w:p>
+            <w:pPr>
+              <w:pStyle w:val="Compact"/>
+              <w:jc w:val="center"/>
+            </w:pPr>
+            <w:r>
+              <w:t xml:space="preserve">34/40</w:t>
+            </w:r>
+          </w:p>
+        </w:tc>
+        <w:tc>
+          <w:tcPr/>
+          <w:p>
+            <w:pPr>
+              <w:pStyle w:val="Compact"/>
+              <w:jc w:val="left"/>
+            </w:pPr>
+            <w:r>
+              <w:t xml:space="preserve">41.4 [35.1, 47.1]</w:t>
+            </w:r>
+          </w:p>
+        </w:tc>
+        <w:tc>
+          <w:tcPr/>
+          <w:p>
+            <w:pPr>
+              <w:pStyle w:val="Compact"/>
+              <w:jc w:val="left"/>
+            </w:pPr>
+            <w:r>
+              <w:t xml:space="preserve">64.9 [55.4, 73.5]</w:t>
+            </w:r>
+          </w:p>
+        </w:tc>
+        <w:tc>
+          <w:tcPr/>
+          <w:p>
+            <w:pPr>
+              <w:pStyle w:val="Compact"/>
+              <w:jc w:val="left"/>
+            </w:pPr>
+            <w:r>
+              <w:t xml:space="preserve">46.9 [39.6, 53.8]</w:t>
+            </w:r>
+          </w:p>
+        </w:tc>
+      </w:tr>
+      <w:tr>
+        <w:tc>
+          <w:tcPr/>
+          <w:p>
+            <w:pPr>
+              <w:pStyle w:val="Compact"/>
+              <w:jc w:val="left"/>
+            </w:pPr>
+            <w:r>
+              <w:t xml:space="preserve">20% padding</w:t>
+            </w:r>
+          </w:p>
+        </w:tc>
+        <w:tc>
+          <w:tcPr/>
+          <w:p>
+            <w:pPr>
+              <w:pStyle w:val="Compact"/>
+              <w:jc w:val="center"/>
+            </w:pPr>
+            <w:r>
+              <w:t xml:space="preserve">28/40</w:t>
+            </w:r>
+          </w:p>
+        </w:tc>
+        <w:tc>
+          <w:tcPr/>
+          <w:p>
+            <w:pPr>
+              <w:pStyle w:val="Compact"/>
+              <w:jc w:val="left"/>
+            </w:pPr>
+            <w:r>
+              <w:t xml:space="preserve">59.0 [46.6, 70.8]</w:t>
+            </w:r>
+          </w:p>
+        </w:tc>
+        <w:tc>
+          <w:tcPr/>
+          <w:p>
+            <w:pPr>
+              <w:pStyle w:val="Compact"/>
+              <w:jc w:val="left"/>
+            </w:pPr>
+            <w:r>
+              <w:t xml:space="preserve">69.5 [54.7, 82.2]</w:t>
+            </w:r>
+          </w:p>
+        </w:tc>
+        <w:tc>
+          <w:tcPr/>
+          <w:p>
+            <w:pPr>
+              <w:pStyle w:val="Compact"/>
+              <w:jc w:val="left"/>
+            </w:pPr>
+            <w:r>
+              <w:t xml:space="preserve">59.5 [46.8, 71.8]</w:t>
+            </w:r>
+          </w:p>
+        </w:tc>
+      </w:tr>
+      <w:tr>
+        <w:tc>
+          <w:tcPr/>
+          <w:p>
+            <w:pPr>
+              <w:pStyle w:val="Compact"/>
+              <w:jc w:val="left"/>
+            </w:pPr>
+            <w:r>
+              <w:t xml:space="preserve">Capped screening procedure</w:t>
+            </w:r>
+          </w:p>
+        </w:tc>
+        <w:tc>
+          <w:tcPr/>
+          <w:p>
+            <w:pPr>
+              <w:pStyle w:val="Compact"/>
+              <w:jc w:val="center"/>
+            </w:pPr>
+            <w:r>
+              <w:t xml:space="preserve">34/40</w:t>
+            </w:r>
+          </w:p>
+        </w:tc>
+        <w:tc>
+          <w:tcPr/>
+          <w:p>
+            <w:pPr>
+              <w:pStyle w:val="Compact"/>
+              <w:jc w:val="left"/>
+            </w:pPr>
+            <w:r>
+              <w:t xml:space="preserve">72.6 [61.2, 82.9]</w:t>
+            </w:r>
+          </w:p>
+        </w:tc>
+        <w:tc>
+          <w:tcPr/>
+          <w:p>
+            <w:pPr>
+              <w:pStyle w:val="Compact"/>
+              <w:jc w:val="left"/>
+            </w:pPr>
+            <w:r>
+              <w:t xml:space="preserve">83.4 [71.3, 93.3]</w:t>
+            </w:r>
+          </w:p>
+        </w:tc>
+        <w:tc>
+          <w:tcPr/>
+          <w:p>
+            <w:pPr>
+              <w:pStyle w:val="Compact"/>
+              <w:jc w:val="left"/>
+            </w:pPr>
+            <w:r>
+              <w:t xml:space="preserve">80.1 [68.5, 90.2]</w:t>
+            </w:r>
+          </w:p>
+        </w:tc>
+      </w:tr>
+      <w:tr>
+        <w:tc>
+          <w:tcPr/>
+          <w:p>
+            <w:pPr>
+              <w:pStyle w:val="Compact"/>
+              <w:jc w:val="left"/>
+            </w:pPr>
+            <w:r>
+              <w:t xml:space="preserve">Screened conservative</w:t>
+            </w:r>
+          </w:p>
+        </w:tc>
+        <w:tc>
+          <w:tcPr/>
+          <w:p>
+            <w:pPr>
+              <w:pStyle w:val="Compact"/>
+              <w:jc w:val="center"/>
+            </w:pPr>
+            <w:r>
+              <w:t xml:space="preserve">34/40</w:t>
+            </w:r>
+          </w:p>
+        </w:tc>
+        <w:tc>
+          <w:tcPr/>
+          <w:p>
+            <w:pPr>
+              <w:pStyle w:val="Compact"/>
+              <w:jc w:val="left"/>
+            </w:pPr>
+            <w:r>
+              <w:t xml:space="preserve">75.3 [63.6, 85.7]</w:t>
+            </w:r>
+          </w:p>
+        </w:tc>
+        <w:tc>
+          <w:tcPr/>
+          <w:p>
+            <w:pPr>
+              <w:pStyle w:val="Compact"/>
+              <w:jc w:val="left"/>
+            </w:pPr>
+            <w:r>
+              <w:t xml:space="preserve">83.2 [71.3, 93.3]</w:t>
+            </w:r>
+          </w:p>
+        </w:tc>
+        <w:tc>
+          <w:tcPr/>
+          <w:p>
+            <w:pPr>
+              <w:pStyle w:val="Compact"/>
+              <w:jc w:val="left"/>
+            </w:pPr>
+            <w:r>
+              <w:t xml:space="preserve">77.3 [65.9, 87.5]</w:t>
+            </w:r>
+          </w:p>
+        </w:tc>
+      </w:tr>
+      <w:tr>
+        <w:tc>
+          <w:tcPr/>
+          <w:p>
+            <w:pPr>
+              <w:pStyle w:val="Compact"/>
+              <w:jc w:val="left"/>
+            </w:pPr>
+            <w:r>
+              <w:t xml:space="preserve">Admitted, capped procedure</w:t>
+            </w:r>
+          </w:p>
+        </w:tc>
+        <w:tc>
+          <w:tcPr/>
+          <w:p>
+            <w:pPr>
+              <w:pStyle w:val="Compact"/>
+            </w:pPr>
+          </w:p>
+        </w:tc>
+        <w:tc>
+          <w:tcPr/>
+          <w:p>
+            <w:pPr>
+              <w:pStyle w:val="Compact"/>
+              <w:jc w:val="left"/>
+            </w:pPr>
+            <w:r>
+              <w:t xml:space="preserve">24</w:t>
+            </w:r>
+          </w:p>
+        </w:tc>
+        <w:tc>
+          <w:tcPr/>
+          <w:p>
+            <w:pPr>
+              <w:pStyle w:val="Compact"/>
+              <w:jc w:val="left"/>
+            </w:pPr>
+            <w:r>
+              <w:t xml:space="preserve">34</w:t>
+            </w:r>
+          </w:p>
+        </w:tc>
+        <w:tc>
+          <w:tcPr/>
+          <w:p>
+            <w:pPr>
+              <w:pStyle w:val="Compact"/>
+              <w:jc w:val="left"/>
+            </w:pPr>
+            <w:r>
+              <w:t xml:space="preserve">30</w:t>
+            </w:r>
+          </w:p>
+        </w:tc>
+      </w:tr>
+      <w:tr>
+        <w:tc>
+          <w:tcPr/>
+          <w:p>
+            <w:pPr>
+              <w:pStyle w:val="Compact"/>
+              <w:jc w:val="left"/>
+            </w:pPr>
+            <w:r>
+              <w:t xml:space="preserve">Admitted, screened conservative</w:t>
+            </w:r>
+          </w:p>
+        </w:tc>
+        <w:tc>
+          <w:tcPr/>
+          <w:p>
+            <w:pPr>
+              <w:pStyle w:val="Compact"/>
+            </w:pPr>
+          </w:p>
+        </w:tc>
+        <w:tc>
+          <w:tcPr/>
+          <w:p>
+            <w:pPr>
+              <w:pStyle w:val="Compact"/>
+              <w:jc w:val="left"/>
+            </w:pPr>
+            <w:r>
+              <w:t xml:space="preserve">25</w:t>
+            </w:r>
+          </w:p>
+        </w:tc>
+        <w:tc>
+          <w:tcPr/>
+          <w:p>
+            <w:pPr>
+              <w:pStyle w:val="Compact"/>
+              <w:jc w:val="left"/>
+            </w:pPr>
+            <w:r>
+              <w:t xml:space="preserve">28</w:t>
+            </w:r>
+          </w:p>
+        </w:tc>
+        <w:tc>
+          <w:tcPr/>
+          <w:p>
+            <w:pPr>
+              <w:pStyle w:val="Compact"/>
+              <w:jc w:val="left"/>
+            </w:pPr>
+            <w:r>
+              <w:t xml:space="preserve">26</w:t>
+            </w:r>
+          </w:p>
+        </w:tc>
+      </w:tr>
+    </w:tbl>
+    <w:bookmarkEnd w:id="80"/>
+    <w:bookmarkEnd w:id="81"/>
+    <w:bookmarkStart w:id="83" w:name="confirmatory-studies-1"/>
     <w:p>
       <w:pPr>
         <w:pStyle w:val="Heading2"/>
@@ -10705,7 +11727,7 @@
           <w:rPr>
             <w:rStyle w:val="Hyperlink"/>
           </w:rPr>
-          <w:t xml:space="preserve">6</w:t>
+          <w:t xml:space="preserve">7</w:t>
         </w:r>
       </w:hyperlink>
       <w:r>
@@ -10769,7 +11791,7 @@
         <w:t xml:space="preserve">solvers, to 94.4% and 94.9%.</w:t>
       </w:r>
     </w:p>
-    <w:bookmarkStart w:id="80" w:name="tab:primaries"/>
+    <w:bookmarkStart w:id="82" w:name="tab:primaries"/>
     <w:p>
       <w:pPr>
         <w:pStyle w:val="TableCaption"/>
@@ -11362,9 +12384,9 @@
         </w:tc>
       </w:tr>
     </w:tbl>
-    <w:bookmarkEnd w:id="80"/>
-    <w:bookmarkEnd w:id="81"/>
-    <w:bookmarkStart w:id="82" w:name="comparison-with-robust-optimization"/>
+    <w:bookmarkEnd w:id="82"/>
+    <w:bookmarkEnd w:id="83"/>
+    <w:bookmarkStart w:id="84" w:name="comparison-with-robust-optimization"/>
     <w:p>
       <w:pPr>
         <w:pStyle w:val="Heading2"/>
@@ -11415,7 +12437,7 @@
           <w:rPr>
             <w:rStyle w:val="Hyperlink"/>
           </w:rPr>
-          <w:t xml:space="preserve">6</w:t>
+          <w:t xml:space="preserve">7</w:t>
         </w:r>
       </w:hyperlink>
       <w:r>
@@ -11446,9 +12468,9 @@
         <w:t xml:space="preserve">planner tested; its strength is that it works with any existing solver.</w:t>
       </w:r>
     </w:p>
-    <w:bookmarkEnd w:id="82"/>
-    <w:bookmarkEnd w:id="83"/>
-    <w:bookmarkStart w:id="88" w:name="discussion"/>
+    <w:bookmarkEnd w:id="84"/>
+    <w:bookmarkEnd w:id="85"/>
+    <w:bookmarkStart w:id="90" w:name="discussion"/>
     <w:p>
       <w:pPr>
         <w:pStyle w:val="Heading1"/>
@@ -11457,7 +12479,7 @@
         <w:t xml:space="preserve">Discussion</w:t>
       </w:r>
     </w:p>
-    <w:bookmarkStart w:id="84" w:name="key-findings-and-implications"/>
+    <w:bookmarkStart w:id="86" w:name="key-findings-and-implications"/>
     <w:p>
       <w:pPr>
         <w:pStyle w:val="Heading2"/>
@@ -11534,8 +12556,8 @@
         <w:t xml:space="preserve">model.</w:t>
       </w:r>
     </w:p>
-    <w:bookmarkEnd w:id="84"/>
-    <w:bookmarkStart w:id="85" w:name="limitations"/>
+    <w:bookmarkEnd w:id="86"/>
+    <w:bookmarkStart w:id="87" w:name="limitations"/>
     <w:p>
       <w:pPr>
         <w:pStyle w:val="Heading2"/>
@@ -11549,31 +12571,37 @@
         <w:pStyle w:val="FirstParagraph"/>
       </w:pPr>
       <w:r>
-        <w:t xml:space="preserve">The study has clear limits. The cities are synthetic squares and the delay model is</w:t>
-      </w:r>
-      <w:r>
-        <w:t xml:space="preserve"> </w:t>
-      </w:r>
-      <w:r>
-        <w:t xml:space="preserve">assumed, not estimated from real traffic data, so the percentages are not forecasts</w:t>
-      </w:r>
-      <w:r>
-        <w:t xml:space="preserve"> </w:t>
-      </w:r>
-      <w:r>
-        <w:t xml:space="preserve">for a real fleet. The benchmark and Amazon checks show that the result is not specific to the</w:t>
-      </w:r>
-      <w:r>
-        <w:t xml:space="preserve"> </w:t>
-      </w:r>
-      <w:r>
-        <w:t xml:space="preserve">instance generator, but even the Amazon routes use assumed delivery windows and an</w:t>
-      </w:r>
-      <w:r>
-        <w:t xml:space="preserve"> </w:t>
-      </w:r>
-      <w:r>
-        <w:t xml:space="preserve">assumed delay model. The confirmatory studies show that the findings repeat on new</w:t>
+        <w:t xml:space="preserve">The study has clear limits. In the main studies the cities are synthetic squares and the</w:t>
+      </w:r>
+      <w:r>
+        <w:t xml:space="preserve"> </w:t>
+      </w:r>
+      <w:r>
+        <w:t xml:space="preserve">delay model is assumed, so the percentages are not forecasts for a real fleet. The benchmark and Amazon checks show that the result is not specific to the</w:t>
+      </w:r>
+      <w:r>
+        <w:t xml:space="preserve"> </w:t>
+      </w:r>
+      <w:r>
+        <w:t xml:space="preserve">instance generator or to the assumed delay model, but the Amazon routes use</w:t>
+      </w:r>
+      <w:r>
+        <w:t xml:space="preserve"> </w:t>
+      </w:r>
+      <w:r>
+        <w:t xml:space="preserve">assumed delivery windows, and their delays were fitted in New York, not in the</w:t>
+      </w:r>
+      <w:r>
+        <w:t xml:space="preserve"> </w:t>
+      </w:r>
+      <w:r>
+        <w:t xml:space="preserve">cities where the routes were driven. The New York data also show that the assumed</w:t>
+      </w:r>
+      <w:r>
+        <w:t xml:space="preserve"> </w:t>
+      </w:r>
+      <w:r>
+        <w:t xml:space="preserve">rush-hour slowdown was wrong for that city. The confirmatory studies show that the findings repeat on new</w:t>
       </w:r>
       <w:r>
         <w:t xml:space="preserve"> </w:t>
@@ -11624,8 +12652,8 @@
         <w:t xml:space="preserve">times, and breakdowns and same-day replanning are not modelled.</w:t>
       </w:r>
     </w:p>
-    <w:bookmarkEnd w:id="85"/>
-    <w:bookmarkStart w:id="86" w:name="recommendations"/>
+    <w:bookmarkEnd w:id="87"/>
+    <w:bookmarkStart w:id="88" w:name="recommendations"/>
     <w:p>
       <w:pPr>
         <w:pStyle w:val="Heading2"/>
@@ -11651,13 +12679,13 @@
         <w:t xml:space="preserve"> </w:t>
       </w:r>
       <w:r>
-        <w:t xml:space="preserve">uncertainty directly, are the clearest next step, together with a test on real</w:t>
-      </w:r>
-      <w:r>
-        <w:t xml:space="preserve"> </w:t>
-      </w:r>
-      <w:r>
-        <w:t xml:space="preserve">travel-time data. The Amazon routes also show that the fallback matters: when no</w:t>
+        <w:t xml:space="preserve">uncertainty directly, are the clearest next step, together with delays measured in the</w:t>
+      </w:r>
+      <w:r>
+        <w:t xml:space="preserve"> </w:t>
+      </w:r>
+      <w:r>
+        <w:t xml:space="preserve">cities where the routes run. The Amazon routes also show that the fallback matters: when no</w:t>
       </w:r>
       <w:r>
         <w:t xml:space="preserve"> </w:t>
@@ -11678,8 +12706,8 @@
         <w:t xml:space="preserve">fallback.</w:t>
       </w:r>
     </w:p>
-    <w:bookmarkEnd w:id="86"/>
-    <w:bookmarkStart w:id="87" w:name="closing-thought"/>
+    <w:bookmarkEnd w:id="88"/>
+    <w:bookmarkStart w:id="89" w:name="closing-thought"/>
     <w:p>
       <w:pPr>
         <w:pStyle w:val="Heading2"/>
@@ -11738,9 +12766,9 @@
         <w:t xml:space="preserve">reliability guarantee to the tools companies already use.</w:t>
       </w:r>
     </w:p>
-    <w:bookmarkEnd w:id="87"/>
-    <w:bookmarkEnd w:id="88"/>
-    <w:bookmarkStart w:id="89" w:name="ai-usage-disclosure"/>
+    <w:bookmarkEnd w:id="89"/>
+    <w:bookmarkEnd w:id="90"/>
+    <w:bookmarkStart w:id="91" w:name="ai-usage-disclosure"/>
     <w:p>
       <w:pPr>
         <w:pStyle w:val="Heading1"/>
@@ -11799,7 +12827,7 @@
         <w:t xml:space="preserve">the content.</w:t>
       </w:r>
     </w:p>
-    <w:bookmarkEnd w:id="89"/>
+    <w:bookmarkEnd w:id="91"/>
     <w:sectPr/>
   </w:body>
 </w:document>

</xml_diff>